<commit_message>
Stage 7: jump by pressing space
</commit_message>
<xml_diff>
--- a/development log.docx
+++ b/development log.docx
@@ -8207,14 +8207,6 @@
         <w:pStyle w:val="p1"/>
       </w:pPr>
       <w:r>
-        <w:t>Currently at Step 5 of Stage 4</w:t>
-      </w:r>
-    </w:p>
-    <w:p>
-      <w:pPr>
-        <w:pStyle w:val="p1"/>
-      </w:pPr>
-      <w:r>
         <w:t xml:space="preserve">Had to spend time studying how SFML stores </w:t>
       </w:r>
       <w:r>
@@ -8250,8 +8242,11 @@
         </w:tabs>
       </w:pPr>
       <w:r>
+        <w:rPr>
+          <w:noProof/>
+        </w:rPr>
         <w:drawing>
-          <wp:anchor distT="0" distB="0" distL="114300" distR="114300" simplePos="0" relativeHeight="251658240" behindDoc="0" locked="0" layoutInCell="1" allowOverlap="1" wp14:anchorId="44CA20CA" wp14:editId="3DB876EA">
+          <wp:anchor distT="0" distB="0" distL="114300" distR="114300" simplePos="0" relativeHeight="251658240" behindDoc="0" locked="0" layoutInCell="1" allowOverlap="1" wp14:anchorId="44CA20CA" wp14:editId="36EC0965">
             <wp:simplePos x="914400" y="3212327"/>
             <wp:positionH relativeFrom="column">
               <wp:align>left</wp:align>
@@ -8310,6 +8305,9 @@
         <w:tab/>
       </w:r>
       <w:r>
+        <w:rPr>
+          <w:noProof/>
+        </w:rPr>
         <w:drawing>
           <wp:inline distT="0" distB="0" distL="0" distR="0" wp14:anchorId="08657FBC" wp14:editId="0E27BB63">
             <wp:extent cx="2592125" cy="2378330"/>
@@ -8355,6 +8353,2026 @@
         <w:pStyle w:val="p1"/>
       </w:pPr>
     </w:p>
+    <w:p>
+      <w:r>
+        <w:t>August 3: Implementing Spike</w:t>
+      </w:r>
+    </w:p>
+    <w:p>
+      <w:pPr>
+        <w:spacing w:before="100" w:beforeAutospacing="1" w:after="100" w:afterAutospacing="1" w:line="240" w:lineRule="auto"/>
+        <w:rPr>
+          <w:rFonts w:ascii="Times New Roman" w:eastAsia="Times New Roman" w:hAnsi="Times New Roman" w:cs="Times New Roman"/>
+          <w:kern w:val="0"/>
+          <w14:ligatures w14:val="none"/>
+        </w:rPr>
+      </w:pPr>
+      <w:r>
+        <w:t xml:space="preserve">Goals are: </w:t>
+      </w:r>
+    </w:p>
+    <w:p>
+      <w:pPr>
+        <w:numPr>
+          <w:ilvl w:val="0"/>
+          <w:numId w:val="4"/>
+        </w:numPr>
+        <w:spacing w:before="100" w:beforeAutospacing="1" w:after="100" w:afterAutospacing="1" w:line="240" w:lineRule="auto"/>
+        <w:rPr>
+          <w:rFonts w:ascii="Times New Roman" w:eastAsia="Times New Roman" w:hAnsi="Times New Roman" w:cs="Times New Roman"/>
+          <w:kern w:val="0"/>
+          <w14:ligatures w14:val="none"/>
+        </w:rPr>
+      </w:pPr>
+      <w:r>
+        <w:rPr>
+          <w:rFonts w:ascii="Times New Roman" w:eastAsia="Times New Roman" w:hAnsi="Times New Roman" w:cs="Times New Roman"/>
+          <w:kern w:val="0"/>
+          <w14:ligatures w14:val="none"/>
+        </w:rPr>
+        <w:t>Create a triangular spike</w:t>
+      </w:r>
+    </w:p>
+    <w:p>
+      <w:pPr>
+        <w:numPr>
+          <w:ilvl w:val="0"/>
+          <w:numId w:val="4"/>
+        </w:numPr>
+        <w:spacing w:before="100" w:beforeAutospacing="1" w:after="100" w:afterAutospacing="1" w:line="240" w:lineRule="auto"/>
+        <w:rPr>
+          <w:rFonts w:ascii="Times New Roman" w:eastAsia="Times New Roman" w:hAnsi="Times New Roman" w:cs="Times New Roman"/>
+          <w:kern w:val="0"/>
+          <w14:ligatures w14:val="none"/>
+        </w:rPr>
+      </w:pPr>
+      <w:r>
+        <w:rPr>
+          <w:rFonts w:ascii="Times New Roman" w:eastAsia="Times New Roman" w:hAnsi="Times New Roman" w:cs="Times New Roman"/>
+          <w:kern w:val="0"/>
+          <w14:ligatures w14:val="none"/>
+        </w:rPr>
+        <w:t>Draw it on top of the platform</w:t>
+      </w:r>
+    </w:p>
+    <w:p>
+      <w:pPr>
+        <w:numPr>
+          <w:ilvl w:val="0"/>
+          <w:numId w:val="4"/>
+        </w:numPr>
+        <w:spacing w:before="100" w:beforeAutospacing="1" w:after="100" w:afterAutospacing="1" w:line="240" w:lineRule="auto"/>
+        <w:rPr>
+          <w:rFonts w:ascii="Times New Roman" w:eastAsia="Times New Roman" w:hAnsi="Times New Roman" w:cs="Times New Roman"/>
+          <w:kern w:val="0"/>
+          <w14:ligatures w14:val="none"/>
+        </w:rPr>
+      </w:pPr>
+      <w:r>
+        <w:rPr>
+          <w:rFonts w:ascii="Times New Roman" w:eastAsia="Times New Roman" w:hAnsi="Times New Roman" w:cs="Times New Roman"/>
+          <w:kern w:val="0"/>
+          <w14:ligatures w14:val="none"/>
+        </w:rPr>
+        <w:t>Give it collision bounds</w:t>
+      </w:r>
+    </w:p>
+    <w:p>
+      <w:pPr>
+        <w:numPr>
+          <w:ilvl w:val="0"/>
+          <w:numId w:val="4"/>
+        </w:numPr>
+        <w:spacing w:before="100" w:beforeAutospacing="1" w:after="100" w:afterAutospacing="1" w:line="240" w:lineRule="auto"/>
+        <w:rPr>
+          <w:rFonts w:ascii="Times New Roman" w:eastAsia="Times New Roman" w:hAnsi="Times New Roman" w:cs="Times New Roman"/>
+          <w:kern w:val="0"/>
+          <w14:ligatures w14:val="none"/>
+        </w:rPr>
+      </w:pPr>
+      <w:r>
+        <w:rPr>
+          <w:rFonts w:ascii="Times New Roman" w:eastAsia="Times New Roman" w:hAnsi="Times New Roman" w:cs="Times New Roman"/>
+          <w:kern w:val="0"/>
+          <w14:ligatures w14:val="none"/>
+        </w:rPr>
+        <w:t>Detect when the player touches it</w:t>
+      </w:r>
+    </w:p>
+    <w:p>
+      <w:r>
+        <w:t xml:space="preserve">Using the SFML class </w:t>
+      </w:r>
+      <w:proofErr w:type="spellStart"/>
+      <w:r>
+        <w:t>ConvexShape</w:t>
+      </w:r>
+      <w:proofErr w:type="spellEnd"/>
+      <w:r>
+        <w:t xml:space="preserve">, I created a Spike class in </w:t>
+      </w:r>
+      <w:proofErr w:type="spellStart"/>
+      <w:r>
+        <w:t>Spike.h</w:t>
+      </w:r>
+      <w:proofErr w:type="spellEnd"/>
+      <w:r>
+        <w:t xml:space="preserve"> that accepts a x value for horizontal width, and a float </w:t>
+      </w:r>
+      <w:proofErr w:type="spellStart"/>
+      <w:r>
+        <w:t>platFormTop</w:t>
+      </w:r>
+      <w:proofErr w:type="spellEnd"/>
+      <w:r>
+        <w:t xml:space="preserve"> since it will always be located on top of the platform.</w:t>
+      </w:r>
+    </w:p>
+    <w:p>
+      <w:r>
+        <w:t xml:space="preserve">In Spike.cpp, the constructor accepts x and </w:t>
+      </w:r>
+      <w:proofErr w:type="spellStart"/>
+      <w:r>
+        <w:t>platFormTop</w:t>
+      </w:r>
+      <w:proofErr w:type="spellEnd"/>
+      <w:r>
+        <w:t xml:space="preserve">.  It creates the actual spike by setting 3 points using </w:t>
+      </w:r>
+      <w:proofErr w:type="spellStart"/>
+      <w:proofErr w:type="gramStart"/>
+      <w:r>
+        <w:t>shape.setPointCount</w:t>
+      </w:r>
+      <w:proofErr w:type="spellEnd"/>
+      <w:proofErr w:type="gramEnd"/>
+      <w:r>
+        <w:t>(3)</w:t>
+      </w:r>
+    </w:p>
+    <w:p>
+      <w:pPr>
+        <w:shd w:val="clear" w:color="auto" w:fill="1F1F1F"/>
+        <w:spacing w:after="0" w:line="270" w:lineRule="atLeast"/>
+        <w:rPr>
+          <w:rFonts w:ascii="Menlo" w:eastAsia="Times New Roman" w:hAnsi="Menlo" w:cs="Menlo"/>
+          <w:color w:val="CCCCCC"/>
+          <w:kern w:val="0"/>
+          <w:sz w:val="18"/>
+          <w:szCs w:val="18"/>
+          <w14:ligatures w14:val="none"/>
+        </w:rPr>
+      </w:pPr>
+      <w:proofErr w:type="gramStart"/>
+      <w:r>
+        <w:rPr>
+          <w:rFonts w:ascii="Menlo" w:eastAsia="Times New Roman" w:hAnsi="Menlo" w:cs="Menlo"/>
+          <w:color w:val="4EC9B0"/>
+          <w:kern w:val="0"/>
+          <w:sz w:val="18"/>
+          <w:szCs w:val="18"/>
+          <w14:ligatures w14:val="none"/>
+        </w:rPr>
+        <w:lastRenderedPageBreak/>
+        <w:t>Spike</w:t>
+      </w:r>
+      <w:r>
+        <w:rPr>
+          <w:rFonts w:ascii="Menlo" w:eastAsia="Times New Roman" w:hAnsi="Menlo" w:cs="Menlo"/>
+          <w:color w:val="CCCCCC"/>
+          <w:kern w:val="0"/>
+          <w:sz w:val="18"/>
+          <w:szCs w:val="18"/>
+          <w14:ligatures w14:val="none"/>
+        </w:rPr>
+        <w:t>::</w:t>
+      </w:r>
+      <w:r>
+        <w:rPr>
+          <w:rFonts w:ascii="Menlo" w:eastAsia="Times New Roman" w:hAnsi="Menlo" w:cs="Menlo"/>
+          <w:color w:val="DCDCAA"/>
+          <w:kern w:val="0"/>
+          <w:sz w:val="18"/>
+          <w:szCs w:val="18"/>
+          <w14:ligatures w14:val="none"/>
+        </w:rPr>
+        <w:t>Spike</w:t>
+      </w:r>
+      <w:r>
+        <w:rPr>
+          <w:rFonts w:ascii="Menlo" w:eastAsia="Times New Roman" w:hAnsi="Menlo" w:cs="Menlo"/>
+          <w:color w:val="CCCCCC"/>
+          <w:kern w:val="0"/>
+          <w:sz w:val="18"/>
+          <w:szCs w:val="18"/>
+          <w14:ligatures w14:val="none"/>
+        </w:rPr>
+        <w:t>(</w:t>
+      </w:r>
+      <w:proofErr w:type="gramEnd"/>
+      <w:r>
+        <w:rPr>
+          <w:rFonts w:ascii="Menlo" w:eastAsia="Times New Roman" w:hAnsi="Menlo" w:cs="Menlo"/>
+          <w:color w:val="569CD6"/>
+          <w:kern w:val="0"/>
+          <w:sz w:val="18"/>
+          <w:szCs w:val="18"/>
+          <w14:ligatures w14:val="none"/>
+        </w:rPr>
+        <w:t>float</w:t>
+      </w:r>
+      <w:r>
+        <w:rPr>
+          <w:rFonts w:ascii="Menlo" w:eastAsia="Times New Roman" w:hAnsi="Menlo" w:cs="Menlo"/>
+          <w:color w:val="CCCCCC"/>
+          <w:kern w:val="0"/>
+          <w:sz w:val="18"/>
+          <w:szCs w:val="18"/>
+          <w14:ligatures w14:val="none"/>
+        </w:rPr>
+        <w:t xml:space="preserve"> </w:t>
+      </w:r>
+      <w:r>
+        <w:rPr>
+          <w:rFonts w:ascii="Menlo" w:eastAsia="Times New Roman" w:hAnsi="Menlo" w:cs="Menlo"/>
+          <w:color w:val="9CDCFE"/>
+          <w:kern w:val="0"/>
+          <w:sz w:val="18"/>
+          <w:szCs w:val="18"/>
+          <w14:ligatures w14:val="none"/>
+        </w:rPr>
+        <w:t>x</w:t>
+      </w:r>
+      <w:r>
+        <w:rPr>
+          <w:rFonts w:ascii="Menlo" w:eastAsia="Times New Roman" w:hAnsi="Menlo" w:cs="Menlo"/>
+          <w:color w:val="CCCCCC"/>
+          <w:kern w:val="0"/>
+          <w:sz w:val="18"/>
+          <w:szCs w:val="18"/>
+          <w14:ligatures w14:val="none"/>
+        </w:rPr>
+        <w:t xml:space="preserve">, </w:t>
+      </w:r>
+      <w:r>
+        <w:rPr>
+          <w:rFonts w:ascii="Menlo" w:eastAsia="Times New Roman" w:hAnsi="Menlo" w:cs="Menlo"/>
+          <w:color w:val="569CD6"/>
+          <w:kern w:val="0"/>
+          <w:sz w:val="18"/>
+          <w:szCs w:val="18"/>
+          <w14:ligatures w14:val="none"/>
+        </w:rPr>
+        <w:t>float</w:t>
+      </w:r>
+      <w:r>
+        <w:rPr>
+          <w:rFonts w:ascii="Menlo" w:eastAsia="Times New Roman" w:hAnsi="Menlo" w:cs="Menlo"/>
+          <w:color w:val="CCCCCC"/>
+          <w:kern w:val="0"/>
+          <w:sz w:val="18"/>
+          <w:szCs w:val="18"/>
+          <w14:ligatures w14:val="none"/>
+        </w:rPr>
+        <w:t xml:space="preserve"> </w:t>
+      </w:r>
+      <w:proofErr w:type="spellStart"/>
+      <w:r>
+        <w:rPr>
+          <w:rFonts w:ascii="Menlo" w:eastAsia="Times New Roman" w:hAnsi="Menlo" w:cs="Menlo"/>
+          <w:color w:val="9CDCFE"/>
+          <w:kern w:val="0"/>
+          <w:sz w:val="18"/>
+          <w:szCs w:val="18"/>
+          <w14:ligatures w14:val="none"/>
+        </w:rPr>
+        <w:t>platformTop</w:t>
+      </w:r>
+      <w:proofErr w:type="spellEnd"/>
+      <w:r>
+        <w:rPr>
+          <w:rFonts w:ascii="Menlo" w:eastAsia="Times New Roman" w:hAnsi="Menlo" w:cs="Menlo"/>
+          <w:color w:val="CCCCCC"/>
+          <w:kern w:val="0"/>
+          <w:sz w:val="18"/>
+          <w:szCs w:val="18"/>
+          <w14:ligatures w14:val="none"/>
+        </w:rPr>
+        <w:t>) {</w:t>
+      </w:r>
+    </w:p>
+    <w:p>
+      <w:pPr>
+        <w:shd w:val="clear" w:color="auto" w:fill="1F1F1F"/>
+        <w:spacing w:after="0" w:line="270" w:lineRule="atLeast"/>
+        <w:rPr>
+          <w:rFonts w:ascii="Menlo" w:eastAsia="Times New Roman" w:hAnsi="Menlo" w:cs="Menlo"/>
+          <w:color w:val="CCCCCC"/>
+          <w:kern w:val="0"/>
+          <w:sz w:val="18"/>
+          <w:szCs w:val="18"/>
+          <w14:ligatures w14:val="none"/>
+        </w:rPr>
+      </w:pPr>
+      <w:r>
+        <w:rPr>
+          <w:rFonts w:ascii="Menlo" w:eastAsia="Times New Roman" w:hAnsi="Menlo" w:cs="Menlo"/>
+          <w:color w:val="CCCCCC"/>
+          <w:kern w:val="0"/>
+          <w:sz w:val="18"/>
+          <w:szCs w:val="18"/>
+          <w14:ligatures w14:val="none"/>
+        </w:rPr>
+        <w:t xml:space="preserve">    </w:t>
+      </w:r>
+      <w:r>
+        <w:rPr>
+          <w:rFonts w:ascii="Menlo" w:eastAsia="Times New Roman" w:hAnsi="Menlo" w:cs="Menlo"/>
+          <w:color w:val="569CD6"/>
+          <w:kern w:val="0"/>
+          <w:sz w:val="18"/>
+          <w:szCs w:val="18"/>
+          <w14:ligatures w14:val="none"/>
+        </w:rPr>
+        <w:t>const</w:t>
+      </w:r>
+      <w:r>
+        <w:rPr>
+          <w:rFonts w:ascii="Menlo" w:eastAsia="Times New Roman" w:hAnsi="Menlo" w:cs="Menlo"/>
+          <w:color w:val="CCCCCC"/>
+          <w:kern w:val="0"/>
+          <w:sz w:val="18"/>
+          <w:szCs w:val="18"/>
+          <w14:ligatures w14:val="none"/>
+        </w:rPr>
+        <w:t xml:space="preserve"> </w:t>
+      </w:r>
+      <w:r>
+        <w:rPr>
+          <w:rFonts w:ascii="Menlo" w:eastAsia="Times New Roman" w:hAnsi="Menlo" w:cs="Menlo"/>
+          <w:color w:val="569CD6"/>
+          <w:kern w:val="0"/>
+          <w:sz w:val="18"/>
+          <w:szCs w:val="18"/>
+          <w14:ligatures w14:val="none"/>
+        </w:rPr>
+        <w:t>float</w:t>
+      </w:r>
+      <w:r>
+        <w:rPr>
+          <w:rFonts w:ascii="Menlo" w:eastAsia="Times New Roman" w:hAnsi="Menlo" w:cs="Menlo"/>
+          <w:color w:val="CCCCCC"/>
+          <w:kern w:val="0"/>
+          <w:sz w:val="18"/>
+          <w:szCs w:val="18"/>
+          <w14:ligatures w14:val="none"/>
+        </w:rPr>
+        <w:t xml:space="preserve"> </w:t>
+      </w:r>
+      <w:r>
+        <w:rPr>
+          <w:rFonts w:ascii="Menlo" w:eastAsia="Times New Roman" w:hAnsi="Menlo" w:cs="Menlo"/>
+          <w:color w:val="9CDCFE"/>
+          <w:kern w:val="0"/>
+          <w:sz w:val="18"/>
+          <w:szCs w:val="18"/>
+          <w14:ligatures w14:val="none"/>
+        </w:rPr>
+        <w:t>width</w:t>
+      </w:r>
+      <w:r>
+        <w:rPr>
+          <w:rFonts w:ascii="Menlo" w:eastAsia="Times New Roman" w:hAnsi="Menlo" w:cs="Menlo"/>
+          <w:color w:val="CCCCCC"/>
+          <w:kern w:val="0"/>
+          <w:sz w:val="18"/>
+          <w:szCs w:val="18"/>
+          <w14:ligatures w14:val="none"/>
+        </w:rPr>
+        <w:t xml:space="preserve"> </w:t>
+      </w:r>
+      <w:r>
+        <w:rPr>
+          <w:rFonts w:ascii="Menlo" w:eastAsia="Times New Roman" w:hAnsi="Menlo" w:cs="Menlo"/>
+          <w:color w:val="D4D4D4"/>
+          <w:kern w:val="0"/>
+          <w:sz w:val="18"/>
+          <w:szCs w:val="18"/>
+          <w14:ligatures w14:val="none"/>
+        </w:rPr>
+        <w:t>=</w:t>
+      </w:r>
+      <w:r>
+        <w:rPr>
+          <w:rFonts w:ascii="Menlo" w:eastAsia="Times New Roman" w:hAnsi="Menlo" w:cs="Menlo"/>
+          <w:color w:val="CCCCCC"/>
+          <w:kern w:val="0"/>
+          <w:sz w:val="18"/>
+          <w:szCs w:val="18"/>
+          <w14:ligatures w14:val="none"/>
+        </w:rPr>
+        <w:t xml:space="preserve"> </w:t>
+      </w:r>
+      <w:r>
+        <w:rPr>
+          <w:rFonts w:ascii="Menlo" w:eastAsia="Times New Roman" w:hAnsi="Menlo" w:cs="Menlo"/>
+          <w:color w:val="B5CEA8"/>
+          <w:kern w:val="0"/>
+          <w:sz w:val="18"/>
+          <w:szCs w:val="18"/>
+          <w14:ligatures w14:val="none"/>
+        </w:rPr>
+        <w:t>50.f</w:t>
+      </w:r>
+      <w:r>
+        <w:rPr>
+          <w:rFonts w:ascii="Menlo" w:eastAsia="Times New Roman" w:hAnsi="Menlo" w:cs="Menlo"/>
+          <w:color w:val="CCCCCC"/>
+          <w:kern w:val="0"/>
+          <w:sz w:val="18"/>
+          <w:szCs w:val="18"/>
+          <w14:ligatures w14:val="none"/>
+        </w:rPr>
+        <w:t>;</w:t>
+      </w:r>
+    </w:p>
+    <w:p>
+      <w:pPr>
+        <w:shd w:val="clear" w:color="auto" w:fill="1F1F1F"/>
+        <w:spacing w:after="0" w:line="270" w:lineRule="atLeast"/>
+        <w:rPr>
+          <w:rFonts w:ascii="Menlo" w:eastAsia="Times New Roman" w:hAnsi="Menlo" w:cs="Menlo"/>
+          <w:color w:val="CCCCCC"/>
+          <w:kern w:val="0"/>
+          <w:sz w:val="18"/>
+          <w:szCs w:val="18"/>
+          <w14:ligatures w14:val="none"/>
+        </w:rPr>
+      </w:pPr>
+      <w:r>
+        <w:rPr>
+          <w:rFonts w:ascii="Menlo" w:eastAsia="Times New Roman" w:hAnsi="Menlo" w:cs="Menlo"/>
+          <w:color w:val="CCCCCC"/>
+          <w:kern w:val="0"/>
+          <w:sz w:val="18"/>
+          <w:szCs w:val="18"/>
+          <w14:ligatures w14:val="none"/>
+        </w:rPr>
+        <w:t xml:space="preserve">    </w:t>
+      </w:r>
+      <w:r>
+        <w:rPr>
+          <w:rFonts w:ascii="Menlo" w:eastAsia="Times New Roman" w:hAnsi="Menlo" w:cs="Menlo"/>
+          <w:color w:val="569CD6"/>
+          <w:kern w:val="0"/>
+          <w:sz w:val="18"/>
+          <w:szCs w:val="18"/>
+          <w14:ligatures w14:val="none"/>
+        </w:rPr>
+        <w:t>const</w:t>
+      </w:r>
+      <w:r>
+        <w:rPr>
+          <w:rFonts w:ascii="Menlo" w:eastAsia="Times New Roman" w:hAnsi="Menlo" w:cs="Menlo"/>
+          <w:color w:val="CCCCCC"/>
+          <w:kern w:val="0"/>
+          <w:sz w:val="18"/>
+          <w:szCs w:val="18"/>
+          <w14:ligatures w14:val="none"/>
+        </w:rPr>
+        <w:t xml:space="preserve"> </w:t>
+      </w:r>
+      <w:r>
+        <w:rPr>
+          <w:rFonts w:ascii="Menlo" w:eastAsia="Times New Roman" w:hAnsi="Menlo" w:cs="Menlo"/>
+          <w:color w:val="569CD6"/>
+          <w:kern w:val="0"/>
+          <w:sz w:val="18"/>
+          <w:szCs w:val="18"/>
+          <w14:ligatures w14:val="none"/>
+        </w:rPr>
+        <w:t>float</w:t>
+      </w:r>
+      <w:r>
+        <w:rPr>
+          <w:rFonts w:ascii="Menlo" w:eastAsia="Times New Roman" w:hAnsi="Menlo" w:cs="Menlo"/>
+          <w:color w:val="CCCCCC"/>
+          <w:kern w:val="0"/>
+          <w:sz w:val="18"/>
+          <w:szCs w:val="18"/>
+          <w14:ligatures w14:val="none"/>
+        </w:rPr>
+        <w:t xml:space="preserve"> </w:t>
+      </w:r>
+      <w:r>
+        <w:rPr>
+          <w:rFonts w:ascii="Menlo" w:eastAsia="Times New Roman" w:hAnsi="Menlo" w:cs="Menlo"/>
+          <w:color w:val="9CDCFE"/>
+          <w:kern w:val="0"/>
+          <w:sz w:val="18"/>
+          <w:szCs w:val="18"/>
+          <w14:ligatures w14:val="none"/>
+        </w:rPr>
+        <w:t>height</w:t>
+      </w:r>
+      <w:r>
+        <w:rPr>
+          <w:rFonts w:ascii="Menlo" w:eastAsia="Times New Roman" w:hAnsi="Menlo" w:cs="Menlo"/>
+          <w:color w:val="CCCCCC"/>
+          <w:kern w:val="0"/>
+          <w:sz w:val="18"/>
+          <w:szCs w:val="18"/>
+          <w14:ligatures w14:val="none"/>
+        </w:rPr>
+        <w:t xml:space="preserve"> </w:t>
+      </w:r>
+      <w:r>
+        <w:rPr>
+          <w:rFonts w:ascii="Menlo" w:eastAsia="Times New Roman" w:hAnsi="Menlo" w:cs="Menlo"/>
+          <w:color w:val="D4D4D4"/>
+          <w:kern w:val="0"/>
+          <w:sz w:val="18"/>
+          <w:szCs w:val="18"/>
+          <w14:ligatures w14:val="none"/>
+        </w:rPr>
+        <w:t>=</w:t>
+      </w:r>
+      <w:r>
+        <w:rPr>
+          <w:rFonts w:ascii="Menlo" w:eastAsia="Times New Roman" w:hAnsi="Menlo" w:cs="Menlo"/>
+          <w:color w:val="CCCCCC"/>
+          <w:kern w:val="0"/>
+          <w:sz w:val="18"/>
+          <w:szCs w:val="18"/>
+          <w14:ligatures w14:val="none"/>
+        </w:rPr>
+        <w:t xml:space="preserve"> </w:t>
+      </w:r>
+      <w:r>
+        <w:rPr>
+          <w:rFonts w:ascii="Menlo" w:eastAsia="Times New Roman" w:hAnsi="Menlo" w:cs="Menlo"/>
+          <w:color w:val="B5CEA8"/>
+          <w:kern w:val="0"/>
+          <w:sz w:val="18"/>
+          <w:szCs w:val="18"/>
+          <w14:ligatures w14:val="none"/>
+        </w:rPr>
+        <w:t>50.f</w:t>
+      </w:r>
+      <w:r>
+        <w:rPr>
+          <w:rFonts w:ascii="Menlo" w:eastAsia="Times New Roman" w:hAnsi="Menlo" w:cs="Menlo"/>
+          <w:color w:val="CCCCCC"/>
+          <w:kern w:val="0"/>
+          <w:sz w:val="18"/>
+          <w:szCs w:val="18"/>
+          <w14:ligatures w14:val="none"/>
+        </w:rPr>
+        <w:t>;</w:t>
+      </w:r>
+    </w:p>
+    <w:p>
+      <w:pPr>
+        <w:shd w:val="clear" w:color="auto" w:fill="1F1F1F"/>
+        <w:spacing w:after="0" w:line="270" w:lineRule="atLeast"/>
+        <w:rPr>
+          <w:rFonts w:ascii="Menlo" w:eastAsia="Times New Roman" w:hAnsi="Menlo" w:cs="Menlo"/>
+          <w:color w:val="CCCCCC"/>
+          <w:kern w:val="0"/>
+          <w:sz w:val="18"/>
+          <w:szCs w:val="18"/>
+          <w14:ligatures w14:val="none"/>
+        </w:rPr>
+      </w:pPr>
+    </w:p>
+    <w:p>
+      <w:pPr>
+        <w:shd w:val="clear" w:color="auto" w:fill="1F1F1F"/>
+        <w:spacing w:after="0" w:line="270" w:lineRule="atLeast"/>
+        <w:rPr>
+          <w:rFonts w:ascii="Menlo" w:eastAsia="Times New Roman" w:hAnsi="Menlo" w:cs="Menlo"/>
+          <w:color w:val="CCCCCC"/>
+          <w:kern w:val="0"/>
+          <w:sz w:val="18"/>
+          <w:szCs w:val="18"/>
+          <w14:ligatures w14:val="none"/>
+        </w:rPr>
+      </w:pPr>
+      <w:r>
+        <w:rPr>
+          <w:rFonts w:ascii="Menlo" w:eastAsia="Times New Roman" w:hAnsi="Menlo" w:cs="Menlo"/>
+          <w:color w:val="CCCCCC"/>
+          <w:kern w:val="0"/>
+          <w:sz w:val="18"/>
+          <w:szCs w:val="18"/>
+          <w14:ligatures w14:val="none"/>
+        </w:rPr>
+        <w:t xml:space="preserve">    </w:t>
+      </w:r>
+      <w:proofErr w:type="spellStart"/>
+      <w:proofErr w:type="gramStart"/>
+      <w:r>
+        <w:rPr>
+          <w:rFonts w:ascii="Menlo" w:eastAsia="Times New Roman" w:hAnsi="Menlo" w:cs="Menlo"/>
+          <w:color w:val="9CDCFE"/>
+          <w:kern w:val="0"/>
+          <w:sz w:val="18"/>
+          <w:szCs w:val="18"/>
+          <w14:ligatures w14:val="none"/>
+        </w:rPr>
+        <w:t>shape</w:t>
+      </w:r>
+      <w:r>
+        <w:rPr>
+          <w:rFonts w:ascii="Menlo" w:eastAsia="Times New Roman" w:hAnsi="Menlo" w:cs="Menlo"/>
+          <w:color w:val="CCCCCC"/>
+          <w:kern w:val="0"/>
+          <w:sz w:val="18"/>
+          <w:szCs w:val="18"/>
+          <w14:ligatures w14:val="none"/>
+        </w:rPr>
+        <w:t>.</w:t>
+      </w:r>
+      <w:r>
+        <w:rPr>
+          <w:rFonts w:ascii="Menlo" w:eastAsia="Times New Roman" w:hAnsi="Menlo" w:cs="Menlo"/>
+          <w:color w:val="DCDCAA"/>
+          <w:kern w:val="0"/>
+          <w:sz w:val="18"/>
+          <w:szCs w:val="18"/>
+          <w14:ligatures w14:val="none"/>
+        </w:rPr>
+        <w:t>setPointCount</w:t>
+      </w:r>
+      <w:proofErr w:type="spellEnd"/>
+      <w:proofErr w:type="gramEnd"/>
+      <w:r>
+        <w:rPr>
+          <w:rFonts w:ascii="Menlo" w:eastAsia="Times New Roman" w:hAnsi="Menlo" w:cs="Menlo"/>
+          <w:color w:val="CCCCCC"/>
+          <w:kern w:val="0"/>
+          <w:sz w:val="18"/>
+          <w:szCs w:val="18"/>
+          <w14:ligatures w14:val="none"/>
+        </w:rPr>
+        <w:t>(</w:t>
+      </w:r>
+      <w:r>
+        <w:rPr>
+          <w:rFonts w:ascii="Menlo" w:eastAsia="Times New Roman" w:hAnsi="Menlo" w:cs="Menlo"/>
+          <w:color w:val="B5CEA8"/>
+          <w:kern w:val="0"/>
+          <w:sz w:val="18"/>
+          <w:szCs w:val="18"/>
+          <w14:ligatures w14:val="none"/>
+        </w:rPr>
+        <w:t>3</w:t>
+      </w:r>
+      <w:r>
+        <w:rPr>
+          <w:rFonts w:ascii="Menlo" w:eastAsia="Times New Roman" w:hAnsi="Menlo" w:cs="Menlo"/>
+          <w:color w:val="CCCCCC"/>
+          <w:kern w:val="0"/>
+          <w:sz w:val="18"/>
+          <w:szCs w:val="18"/>
+          <w14:ligatures w14:val="none"/>
+        </w:rPr>
+        <w:t>);</w:t>
+      </w:r>
+    </w:p>
+    <w:p>
+      <w:pPr>
+        <w:shd w:val="clear" w:color="auto" w:fill="1F1F1F"/>
+        <w:spacing w:after="0" w:line="270" w:lineRule="atLeast"/>
+        <w:rPr>
+          <w:rFonts w:ascii="Menlo" w:eastAsia="Times New Roman" w:hAnsi="Menlo" w:cs="Menlo"/>
+          <w:color w:val="CCCCCC"/>
+          <w:kern w:val="0"/>
+          <w:sz w:val="18"/>
+          <w:szCs w:val="18"/>
+          <w14:ligatures w14:val="none"/>
+        </w:rPr>
+      </w:pPr>
+    </w:p>
+    <w:p>
+      <w:pPr>
+        <w:shd w:val="clear" w:color="auto" w:fill="1F1F1F"/>
+        <w:spacing w:after="0" w:line="270" w:lineRule="atLeast"/>
+        <w:rPr>
+          <w:rFonts w:ascii="Menlo" w:eastAsia="Times New Roman" w:hAnsi="Menlo" w:cs="Menlo"/>
+          <w:color w:val="CCCCCC"/>
+          <w:kern w:val="0"/>
+          <w:sz w:val="18"/>
+          <w:szCs w:val="18"/>
+          <w14:ligatures w14:val="none"/>
+        </w:rPr>
+      </w:pPr>
+      <w:r>
+        <w:rPr>
+          <w:rFonts w:ascii="Menlo" w:eastAsia="Times New Roman" w:hAnsi="Menlo" w:cs="Menlo"/>
+          <w:color w:val="CCCCCC"/>
+          <w:kern w:val="0"/>
+          <w:sz w:val="18"/>
+          <w:szCs w:val="18"/>
+          <w14:ligatures w14:val="none"/>
+        </w:rPr>
+        <w:t xml:space="preserve">    </w:t>
+      </w:r>
+      <w:proofErr w:type="spellStart"/>
+      <w:proofErr w:type="gramStart"/>
+      <w:r>
+        <w:rPr>
+          <w:rFonts w:ascii="Menlo" w:eastAsia="Times New Roman" w:hAnsi="Menlo" w:cs="Menlo"/>
+          <w:color w:val="9CDCFE"/>
+          <w:kern w:val="0"/>
+          <w:sz w:val="18"/>
+          <w:szCs w:val="18"/>
+          <w14:ligatures w14:val="none"/>
+        </w:rPr>
+        <w:t>shape</w:t>
+      </w:r>
+      <w:r>
+        <w:rPr>
+          <w:rFonts w:ascii="Menlo" w:eastAsia="Times New Roman" w:hAnsi="Menlo" w:cs="Menlo"/>
+          <w:color w:val="CCCCCC"/>
+          <w:kern w:val="0"/>
+          <w:sz w:val="18"/>
+          <w:szCs w:val="18"/>
+          <w14:ligatures w14:val="none"/>
+        </w:rPr>
+        <w:t>.</w:t>
+      </w:r>
+      <w:r>
+        <w:rPr>
+          <w:rFonts w:ascii="Menlo" w:eastAsia="Times New Roman" w:hAnsi="Menlo" w:cs="Menlo"/>
+          <w:color w:val="DCDCAA"/>
+          <w:kern w:val="0"/>
+          <w:sz w:val="18"/>
+          <w:szCs w:val="18"/>
+          <w14:ligatures w14:val="none"/>
+        </w:rPr>
+        <w:t>setPoint</w:t>
+      </w:r>
+      <w:proofErr w:type="spellEnd"/>
+      <w:proofErr w:type="gramEnd"/>
+      <w:r>
+        <w:rPr>
+          <w:rFonts w:ascii="Menlo" w:eastAsia="Times New Roman" w:hAnsi="Menlo" w:cs="Menlo"/>
+          <w:color w:val="CCCCCC"/>
+          <w:kern w:val="0"/>
+          <w:sz w:val="18"/>
+          <w:szCs w:val="18"/>
+          <w14:ligatures w14:val="none"/>
+        </w:rPr>
+        <w:t>(</w:t>
+      </w:r>
+      <w:r>
+        <w:rPr>
+          <w:rFonts w:ascii="Menlo" w:eastAsia="Times New Roman" w:hAnsi="Menlo" w:cs="Menlo"/>
+          <w:color w:val="B5CEA8"/>
+          <w:kern w:val="0"/>
+          <w:sz w:val="18"/>
+          <w:szCs w:val="18"/>
+          <w14:ligatures w14:val="none"/>
+        </w:rPr>
+        <w:t>0</w:t>
+      </w:r>
+      <w:r>
+        <w:rPr>
+          <w:rFonts w:ascii="Menlo" w:eastAsia="Times New Roman" w:hAnsi="Menlo" w:cs="Menlo"/>
+          <w:color w:val="CCCCCC"/>
+          <w:kern w:val="0"/>
+          <w:sz w:val="18"/>
+          <w:szCs w:val="18"/>
+          <w14:ligatures w14:val="none"/>
+        </w:rPr>
+        <w:t xml:space="preserve">, </w:t>
+      </w:r>
+      <w:proofErr w:type="gramStart"/>
+      <w:r>
+        <w:rPr>
+          <w:rFonts w:ascii="Menlo" w:eastAsia="Times New Roman" w:hAnsi="Menlo" w:cs="Menlo"/>
+          <w:color w:val="4EC9B0"/>
+          <w:kern w:val="0"/>
+          <w:sz w:val="18"/>
+          <w:szCs w:val="18"/>
+          <w14:ligatures w14:val="none"/>
+        </w:rPr>
+        <w:t>sf</w:t>
+      </w:r>
+      <w:r>
+        <w:rPr>
+          <w:rFonts w:ascii="Menlo" w:eastAsia="Times New Roman" w:hAnsi="Menlo" w:cs="Menlo"/>
+          <w:color w:val="CCCCCC"/>
+          <w:kern w:val="0"/>
+          <w:sz w:val="18"/>
+          <w:szCs w:val="18"/>
+          <w14:ligatures w14:val="none"/>
+        </w:rPr>
+        <w:t>::</w:t>
+      </w:r>
+      <w:proofErr w:type="gramEnd"/>
+      <w:r>
+        <w:rPr>
+          <w:rFonts w:ascii="Menlo" w:eastAsia="Times New Roman" w:hAnsi="Menlo" w:cs="Menlo"/>
+          <w:color w:val="DCDCAA"/>
+          <w:kern w:val="0"/>
+          <w:sz w:val="18"/>
+          <w:szCs w:val="18"/>
+          <w14:ligatures w14:val="none"/>
+        </w:rPr>
+        <w:t>Vector2</w:t>
+      </w:r>
+      <w:proofErr w:type="gramStart"/>
+      <w:r>
+        <w:rPr>
+          <w:rFonts w:ascii="Menlo" w:eastAsia="Times New Roman" w:hAnsi="Menlo" w:cs="Menlo"/>
+          <w:color w:val="DCDCAA"/>
+          <w:kern w:val="0"/>
+          <w:sz w:val="18"/>
+          <w:szCs w:val="18"/>
+          <w14:ligatures w14:val="none"/>
+        </w:rPr>
+        <w:t>f</w:t>
+      </w:r>
+      <w:r>
+        <w:rPr>
+          <w:rFonts w:ascii="Menlo" w:eastAsia="Times New Roman" w:hAnsi="Menlo" w:cs="Menlo"/>
+          <w:color w:val="CCCCCC"/>
+          <w:kern w:val="0"/>
+          <w:sz w:val="18"/>
+          <w:szCs w:val="18"/>
+          <w14:ligatures w14:val="none"/>
+        </w:rPr>
+        <w:t>(</w:t>
+      </w:r>
+      <w:proofErr w:type="gramEnd"/>
+      <w:r>
+        <w:rPr>
+          <w:rFonts w:ascii="Menlo" w:eastAsia="Times New Roman" w:hAnsi="Menlo" w:cs="Menlo"/>
+          <w:color w:val="B5CEA8"/>
+          <w:kern w:val="0"/>
+          <w:sz w:val="18"/>
+          <w:szCs w:val="18"/>
+          <w14:ligatures w14:val="none"/>
+        </w:rPr>
+        <w:t>0.f</w:t>
+      </w:r>
+      <w:r>
+        <w:rPr>
+          <w:rFonts w:ascii="Menlo" w:eastAsia="Times New Roman" w:hAnsi="Menlo" w:cs="Menlo"/>
+          <w:color w:val="CCCCCC"/>
+          <w:kern w:val="0"/>
+          <w:sz w:val="18"/>
+          <w:szCs w:val="18"/>
+          <w14:ligatures w14:val="none"/>
+        </w:rPr>
+        <w:t xml:space="preserve">, </w:t>
+      </w:r>
+      <w:r>
+        <w:rPr>
+          <w:rFonts w:ascii="Menlo" w:eastAsia="Times New Roman" w:hAnsi="Menlo" w:cs="Menlo"/>
+          <w:color w:val="9CDCFE"/>
+          <w:kern w:val="0"/>
+          <w:sz w:val="18"/>
+          <w:szCs w:val="18"/>
+          <w14:ligatures w14:val="none"/>
+        </w:rPr>
+        <w:t>height</w:t>
+      </w:r>
+      <w:r>
+        <w:rPr>
+          <w:rFonts w:ascii="Menlo" w:eastAsia="Times New Roman" w:hAnsi="Menlo" w:cs="Menlo"/>
+          <w:color w:val="CCCCCC"/>
+          <w:kern w:val="0"/>
+          <w:sz w:val="18"/>
+          <w:szCs w:val="18"/>
+          <w14:ligatures w14:val="none"/>
+        </w:rPr>
+        <w:t>));</w:t>
+      </w:r>
+    </w:p>
+    <w:p>
+      <w:pPr>
+        <w:shd w:val="clear" w:color="auto" w:fill="1F1F1F"/>
+        <w:spacing w:after="0" w:line="270" w:lineRule="atLeast"/>
+        <w:rPr>
+          <w:rFonts w:ascii="Menlo" w:eastAsia="Times New Roman" w:hAnsi="Menlo" w:cs="Menlo"/>
+          <w:color w:val="CCCCCC"/>
+          <w:kern w:val="0"/>
+          <w:sz w:val="18"/>
+          <w:szCs w:val="18"/>
+          <w14:ligatures w14:val="none"/>
+        </w:rPr>
+      </w:pPr>
+      <w:r>
+        <w:rPr>
+          <w:rFonts w:ascii="Menlo" w:eastAsia="Times New Roman" w:hAnsi="Menlo" w:cs="Menlo"/>
+          <w:color w:val="CCCCCC"/>
+          <w:kern w:val="0"/>
+          <w:sz w:val="18"/>
+          <w:szCs w:val="18"/>
+          <w14:ligatures w14:val="none"/>
+        </w:rPr>
+        <w:t xml:space="preserve">    </w:t>
+      </w:r>
+      <w:proofErr w:type="spellStart"/>
+      <w:proofErr w:type="gramStart"/>
+      <w:r>
+        <w:rPr>
+          <w:rFonts w:ascii="Menlo" w:eastAsia="Times New Roman" w:hAnsi="Menlo" w:cs="Menlo"/>
+          <w:color w:val="9CDCFE"/>
+          <w:kern w:val="0"/>
+          <w:sz w:val="18"/>
+          <w:szCs w:val="18"/>
+          <w14:ligatures w14:val="none"/>
+        </w:rPr>
+        <w:t>shape</w:t>
+      </w:r>
+      <w:r>
+        <w:rPr>
+          <w:rFonts w:ascii="Menlo" w:eastAsia="Times New Roman" w:hAnsi="Menlo" w:cs="Menlo"/>
+          <w:color w:val="CCCCCC"/>
+          <w:kern w:val="0"/>
+          <w:sz w:val="18"/>
+          <w:szCs w:val="18"/>
+          <w14:ligatures w14:val="none"/>
+        </w:rPr>
+        <w:t>.</w:t>
+      </w:r>
+      <w:r>
+        <w:rPr>
+          <w:rFonts w:ascii="Menlo" w:eastAsia="Times New Roman" w:hAnsi="Menlo" w:cs="Menlo"/>
+          <w:color w:val="DCDCAA"/>
+          <w:kern w:val="0"/>
+          <w:sz w:val="18"/>
+          <w:szCs w:val="18"/>
+          <w14:ligatures w14:val="none"/>
+        </w:rPr>
+        <w:t>setPoint</w:t>
+      </w:r>
+      <w:proofErr w:type="spellEnd"/>
+      <w:proofErr w:type="gramEnd"/>
+      <w:r>
+        <w:rPr>
+          <w:rFonts w:ascii="Menlo" w:eastAsia="Times New Roman" w:hAnsi="Menlo" w:cs="Menlo"/>
+          <w:color w:val="CCCCCC"/>
+          <w:kern w:val="0"/>
+          <w:sz w:val="18"/>
+          <w:szCs w:val="18"/>
+          <w14:ligatures w14:val="none"/>
+        </w:rPr>
+        <w:t>(</w:t>
+      </w:r>
+      <w:r>
+        <w:rPr>
+          <w:rFonts w:ascii="Menlo" w:eastAsia="Times New Roman" w:hAnsi="Menlo" w:cs="Menlo"/>
+          <w:color w:val="B5CEA8"/>
+          <w:kern w:val="0"/>
+          <w:sz w:val="18"/>
+          <w:szCs w:val="18"/>
+          <w14:ligatures w14:val="none"/>
+        </w:rPr>
+        <w:t>1</w:t>
+      </w:r>
+      <w:r>
+        <w:rPr>
+          <w:rFonts w:ascii="Menlo" w:eastAsia="Times New Roman" w:hAnsi="Menlo" w:cs="Menlo"/>
+          <w:color w:val="CCCCCC"/>
+          <w:kern w:val="0"/>
+          <w:sz w:val="18"/>
+          <w:szCs w:val="18"/>
+          <w14:ligatures w14:val="none"/>
+        </w:rPr>
+        <w:t xml:space="preserve">, </w:t>
+      </w:r>
+      <w:proofErr w:type="gramStart"/>
+      <w:r>
+        <w:rPr>
+          <w:rFonts w:ascii="Menlo" w:eastAsia="Times New Roman" w:hAnsi="Menlo" w:cs="Menlo"/>
+          <w:color w:val="4EC9B0"/>
+          <w:kern w:val="0"/>
+          <w:sz w:val="18"/>
+          <w:szCs w:val="18"/>
+          <w14:ligatures w14:val="none"/>
+        </w:rPr>
+        <w:t>sf</w:t>
+      </w:r>
+      <w:r>
+        <w:rPr>
+          <w:rFonts w:ascii="Menlo" w:eastAsia="Times New Roman" w:hAnsi="Menlo" w:cs="Menlo"/>
+          <w:color w:val="CCCCCC"/>
+          <w:kern w:val="0"/>
+          <w:sz w:val="18"/>
+          <w:szCs w:val="18"/>
+          <w14:ligatures w14:val="none"/>
+        </w:rPr>
+        <w:t>::</w:t>
+      </w:r>
+      <w:proofErr w:type="gramEnd"/>
+      <w:r>
+        <w:rPr>
+          <w:rFonts w:ascii="Menlo" w:eastAsia="Times New Roman" w:hAnsi="Menlo" w:cs="Menlo"/>
+          <w:color w:val="DCDCAA"/>
+          <w:kern w:val="0"/>
+          <w:sz w:val="18"/>
+          <w:szCs w:val="18"/>
+          <w14:ligatures w14:val="none"/>
+        </w:rPr>
+        <w:t>Vector2</w:t>
+      </w:r>
+      <w:proofErr w:type="gramStart"/>
+      <w:r>
+        <w:rPr>
+          <w:rFonts w:ascii="Menlo" w:eastAsia="Times New Roman" w:hAnsi="Menlo" w:cs="Menlo"/>
+          <w:color w:val="DCDCAA"/>
+          <w:kern w:val="0"/>
+          <w:sz w:val="18"/>
+          <w:szCs w:val="18"/>
+          <w14:ligatures w14:val="none"/>
+        </w:rPr>
+        <w:t>f</w:t>
+      </w:r>
+      <w:r>
+        <w:rPr>
+          <w:rFonts w:ascii="Menlo" w:eastAsia="Times New Roman" w:hAnsi="Menlo" w:cs="Menlo"/>
+          <w:color w:val="CCCCCC"/>
+          <w:kern w:val="0"/>
+          <w:sz w:val="18"/>
+          <w:szCs w:val="18"/>
+          <w14:ligatures w14:val="none"/>
+        </w:rPr>
+        <w:t>(</w:t>
+      </w:r>
+      <w:proofErr w:type="gramEnd"/>
+      <w:r>
+        <w:rPr>
+          <w:rFonts w:ascii="Menlo" w:eastAsia="Times New Roman" w:hAnsi="Menlo" w:cs="Menlo"/>
+          <w:color w:val="9CDCFE"/>
+          <w:kern w:val="0"/>
+          <w:sz w:val="18"/>
+          <w:szCs w:val="18"/>
+          <w14:ligatures w14:val="none"/>
+        </w:rPr>
+        <w:t>width</w:t>
+      </w:r>
+      <w:r>
+        <w:rPr>
+          <w:rFonts w:ascii="Menlo" w:eastAsia="Times New Roman" w:hAnsi="Menlo" w:cs="Menlo"/>
+          <w:color w:val="CCCCCC"/>
+          <w:kern w:val="0"/>
+          <w:sz w:val="18"/>
+          <w:szCs w:val="18"/>
+          <w14:ligatures w14:val="none"/>
+        </w:rPr>
+        <w:t xml:space="preserve"> </w:t>
+      </w:r>
+      <w:r>
+        <w:rPr>
+          <w:rFonts w:ascii="Menlo" w:eastAsia="Times New Roman" w:hAnsi="Menlo" w:cs="Menlo"/>
+          <w:color w:val="D4D4D4"/>
+          <w:kern w:val="0"/>
+          <w:sz w:val="18"/>
+          <w:szCs w:val="18"/>
+          <w14:ligatures w14:val="none"/>
+        </w:rPr>
+        <w:t>/</w:t>
+      </w:r>
+      <w:r>
+        <w:rPr>
+          <w:rFonts w:ascii="Menlo" w:eastAsia="Times New Roman" w:hAnsi="Menlo" w:cs="Menlo"/>
+          <w:color w:val="CCCCCC"/>
+          <w:kern w:val="0"/>
+          <w:sz w:val="18"/>
+          <w:szCs w:val="18"/>
+          <w14:ligatures w14:val="none"/>
+        </w:rPr>
+        <w:t xml:space="preserve"> </w:t>
+      </w:r>
+      <w:r>
+        <w:rPr>
+          <w:rFonts w:ascii="Menlo" w:eastAsia="Times New Roman" w:hAnsi="Menlo" w:cs="Menlo"/>
+          <w:color w:val="B5CEA8"/>
+          <w:kern w:val="0"/>
+          <w:sz w:val="18"/>
+          <w:szCs w:val="18"/>
+          <w14:ligatures w14:val="none"/>
+        </w:rPr>
+        <w:t>2.f</w:t>
+      </w:r>
+      <w:r>
+        <w:rPr>
+          <w:rFonts w:ascii="Menlo" w:eastAsia="Times New Roman" w:hAnsi="Menlo" w:cs="Menlo"/>
+          <w:color w:val="CCCCCC"/>
+          <w:kern w:val="0"/>
+          <w:sz w:val="18"/>
+          <w:szCs w:val="18"/>
+          <w14:ligatures w14:val="none"/>
+        </w:rPr>
+        <w:t xml:space="preserve">, </w:t>
+      </w:r>
+      <w:r>
+        <w:rPr>
+          <w:rFonts w:ascii="Menlo" w:eastAsia="Times New Roman" w:hAnsi="Menlo" w:cs="Menlo"/>
+          <w:color w:val="B5CEA8"/>
+          <w:kern w:val="0"/>
+          <w:sz w:val="18"/>
+          <w:szCs w:val="18"/>
+          <w14:ligatures w14:val="none"/>
+        </w:rPr>
+        <w:t>0.f</w:t>
+      </w:r>
+      <w:r>
+        <w:rPr>
+          <w:rFonts w:ascii="Menlo" w:eastAsia="Times New Roman" w:hAnsi="Menlo" w:cs="Menlo"/>
+          <w:color w:val="CCCCCC"/>
+          <w:kern w:val="0"/>
+          <w:sz w:val="18"/>
+          <w:szCs w:val="18"/>
+          <w14:ligatures w14:val="none"/>
+        </w:rPr>
+        <w:t>));</w:t>
+      </w:r>
+    </w:p>
+    <w:p>
+      <w:pPr>
+        <w:shd w:val="clear" w:color="auto" w:fill="1F1F1F"/>
+        <w:spacing w:after="0" w:line="270" w:lineRule="atLeast"/>
+        <w:rPr>
+          <w:rFonts w:ascii="Menlo" w:eastAsia="Times New Roman" w:hAnsi="Menlo" w:cs="Menlo"/>
+          <w:color w:val="CCCCCC"/>
+          <w:kern w:val="0"/>
+          <w:sz w:val="18"/>
+          <w:szCs w:val="18"/>
+          <w14:ligatures w14:val="none"/>
+        </w:rPr>
+      </w:pPr>
+      <w:r>
+        <w:rPr>
+          <w:rFonts w:ascii="Menlo" w:eastAsia="Times New Roman" w:hAnsi="Menlo" w:cs="Menlo"/>
+          <w:color w:val="CCCCCC"/>
+          <w:kern w:val="0"/>
+          <w:sz w:val="18"/>
+          <w:szCs w:val="18"/>
+          <w14:ligatures w14:val="none"/>
+        </w:rPr>
+        <w:t xml:space="preserve">    </w:t>
+      </w:r>
+      <w:proofErr w:type="spellStart"/>
+      <w:proofErr w:type="gramStart"/>
+      <w:r>
+        <w:rPr>
+          <w:rFonts w:ascii="Menlo" w:eastAsia="Times New Roman" w:hAnsi="Menlo" w:cs="Menlo"/>
+          <w:color w:val="9CDCFE"/>
+          <w:kern w:val="0"/>
+          <w:sz w:val="18"/>
+          <w:szCs w:val="18"/>
+          <w14:ligatures w14:val="none"/>
+        </w:rPr>
+        <w:t>shape</w:t>
+      </w:r>
+      <w:r>
+        <w:rPr>
+          <w:rFonts w:ascii="Menlo" w:eastAsia="Times New Roman" w:hAnsi="Menlo" w:cs="Menlo"/>
+          <w:color w:val="CCCCCC"/>
+          <w:kern w:val="0"/>
+          <w:sz w:val="18"/>
+          <w:szCs w:val="18"/>
+          <w14:ligatures w14:val="none"/>
+        </w:rPr>
+        <w:t>.</w:t>
+      </w:r>
+      <w:r>
+        <w:rPr>
+          <w:rFonts w:ascii="Menlo" w:eastAsia="Times New Roman" w:hAnsi="Menlo" w:cs="Menlo"/>
+          <w:color w:val="DCDCAA"/>
+          <w:kern w:val="0"/>
+          <w:sz w:val="18"/>
+          <w:szCs w:val="18"/>
+          <w14:ligatures w14:val="none"/>
+        </w:rPr>
+        <w:t>setPoint</w:t>
+      </w:r>
+      <w:proofErr w:type="spellEnd"/>
+      <w:proofErr w:type="gramEnd"/>
+      <w:r>
+        <w:rPr>
+          <w:rFonts w:ascii="Menlo" w:eastAsia="Times New Roman" w:hAnsi="Menlo" w:cs="Menlo"/>
+          <w:color w:val="CCCCCC"/>
+          <w:kern w:val="0"/>
+          <w:sz w:val="18"/>
+          <w:szCs w:val="18"/>
+          <w14:ligatures w14:val="none"/>
+        </w:rPr>
+        <w:t>(</w:t>
+      </w:r>
+      <w:r>
+        <w:rPr>
+          <w:rFonts w:ascii="Menlo" w:eastAsia="Times New Roman" w:hAnsi="Menlo" w:cs="Menlo"/>
+          <w:color w:val="B5CEA8"/>
+          <w:kern w:val="0"/>
+          <w:sz w:val="18"/>
+          <w:szCs w:val="18"/>
+          <w14:ligatures w14:val="none"/>
+        </w:rPr>
+        <w:t>2</w:t>
+      </w:r>
+      <w:r>
+        <w:rPr>
+          <w:rFonts w:ascii="Menlo" w:eastAsia="Times New Roman" w:hAnsi="Menlo" w:cs="Menlo"/>
+          <w:color w:val="CCCCCC"/>
+          <w:kern w:val="0"/>
+          <w:sz w:val="18"/>
+          <w:szCs w:val="18"/>
+          <w14:ligatures w14:val="none"/>
+        </w:rPr>
+        <w:t xml:space="preserve">, </w:t>
+      </w:r>
+      <w:proofErr w:type="gramStart"/>
+      <w:r>
+        <w:rPr>
+          <w:rFonts w:ascii="Menlo" w:eastAsia="Times New Roman" w:hAnsi="Menlo" w:cs="Menlo"/>
+          <w:color w:val="4EC9B0"/>
+          <w:kern w:val="0"/>
+          <w:sz w:val="18"/>
+          <w:szCs w:val="18"/>
+          <w14:ligatures w14:val="none"/>
+        </w:rPr>
+        <w:t>sf</w:t>
+      </w:r>
+      <w:r>
+        <w:rPr>
+          <w:rFonts w:ascii="Menlo" w:eastAsia="Times New Roman" w:hAnsi="Menlo" w:cs="Menlo"/>
+          <w:color w:val="CCCCCC"/>
+          <w:kern w:val="0"/>
+          <w:sz w:val="18"/>
+          <w:szCs w:val="18"/>
+          <w14:ligatures w14:val="none"/>
+        </w:rPr>
+        <w:t>::</w:t>
+      </w:r>
+      <w:proofErr w:type="gramEnd"/>
+      <w:r>
+        <w:rPr>
+          <w:rFonts w:ascii="Menlo" w:eastAsia="Times New Roman" w:hAnsi="Menlo" w:cs="Menlo"/>
+          <w:color w:val="DCDCAA"/>
+          <w:kern w:val="0"/>
+          <w:sz w:val="18"/>
+          <w:szCs w:val="18"/>
+          <w14:ligatures w14:val="none"/>
+        </w:rPr>
+        <w:t>Vector2</w:t>
+      </w:r>
+      <w:proofErr w:type="gramStart"/>
+      <w:r>
+        <w:rPr>
+          <w:rFonts w:ascii="Menlo" w:eastAsia="Times New Roman" w:hAnsi="Menlo" w:cs="Menlo"/>
+          <w:color w:val="DCDCAA"/>
+          <w:kern w:val="0"/>
+          <w:sz w:val="18"/>
+          <w:szCs w:val="18"/>
+          <w14:ligatures w14:val="none"/>
+        </w:rPr>
+        <w:t>f</w:t>
+      </w:r>
+      <w:r>
+        <w:rPr>
+          <w:rFonts w:ascii="Menlo" w:eastAsia="Times New Roman" w:hAnsi="Menlo" w:cs="Menlo"/>
+          <w:color w:val="CCCCCC"/>
+          <w:kern w:val="0"/>
+          <w:sz w:val="18"/>
+          <w:szCs w:val="18"/>
+          <w14:ligatures w14:val="none"/>
+        </w:rPr>
+        <w:t>(</w:t>
+      </w:r>
+      <w:proofErr w:type="gramEnd"/>
+      <w:r>
+        <w:rPr>
+          <w:rFonts w:ascii="Menlo" w:eastAsia="Times New Roman" w:hAnsi="Menlo" w:cs="Menlo"/>
+          <w:color w:val="9CDCFE"/>
+          <w:kern w:val="0"/>
+          <w:sz w:val="18"/>
+          <w:szCs w:val="18"/>
+          <w14:ligatures w14:val="none"/>
+        </w:rPr>
+        <w:t>width</w:t>
+      </w:r>
+      <w:r>
+        <w:rPr>
+          <w:rFonts w:ascii="Menlo" w:eastAsia="Times New Roman" w:hAnsi="Menlo" w:cs="Menlo"/>
+          <w:color w:val="CCCCCC"/>
+          <w:kern w:val="0"/>
+          <w:sz w:val="18"/>
+          <w:szCs w:val="18"/>
+          <w14:ligatures w14:val="none"/>
+        </w:rPr>
+        <w:t xml:space="preserve">, </w:t>
+      </w:r>
+      <w:r>
+        <w:rPr>
+          <w:rFonts w:ascii="Menlo" w:eastAsia="Times New Roman" w:hAnsi="Menlo" w:cs="Menlo"/>
+          <w:color w:val="9CDCFE"/>
+          <w:kern w:val="0"/>
+          <w:sz w:val="18"/>
+          <w:szCs w:val="18"/>
+          <w14:ligatures w14:val="none"/>
+        </w:rPr>
+        <w:t>height</w:t>
+      </w:r>
+      <w:r>
+        <w:rPr>
+          <w:rFonts w:ascii="Menlo" w:eastAsia="Times New Roman" w:hAnsi="Menlo" w:cs="Menlo"/>
+          <w:color w:val="CCCCCC"/>
+          <w:kern w:val="0"/>
+          <w:sz w:val="18"/>
+          <w:szCs w:val="18"/>
+          <w14:ligatures w14:val="none"/>
+        </w:rPr>
+        <w:t>));</w:t>
+      </w:r>
+    </w:p>
+    <w:p>
+      <w:pPr>
+        <w:shd w:val="clear" w:color="auto" w:fill="1F1F1F"/>
+        <w:spacing w:after="0" w:line="270" w:lineRule="atLeast"/>
+        <w:rPr>
+          <w:rFonts w:ascii="Menlo" w:eastAsia="Times New Roman" w:hAnsi="Menlo" w:cs="Menlo"/>
+          <w:color w:val="CCCCCC"/>
+          <w:kern w:val="0"/>
+          <w:sz w:val="18"/>
+          <w:szCs w:val="18"/>
+          <w14:ligatures w14:val="none"/>
+        </w:rPr>
+      </w:pPr>
+    </w:p>
+    <w:p>
+      <w:pPr>
+        <w:shd w:val="clear" w:color="auto" w:fill="1F1F1F"/>
+        <w:spacing w:after="0" w:line="270" w:lineRule="atLeast"/>
+        <w:rPr>
+          <w:rFonts w:ascii="Menlo" w:eastAsia="Times New Roman" w:hAnsi="Menlo" w:cs="Menlo"/>
+          <w:color w:val="CCCCCC"/>
+          <w:kern w:val="0"/>
+          <w:sz w:val="18"/>
+          <w:szCs w:val="18"/>
+          <w14:ligatures w14:val="none"/>
+        </w:rPr>
+      </w:pPr>
+      <w:r>
+        <w:rPr>
+          <w:rFonts w:ascii="Menlo" w:eastAsia="Times New Roman" w:hAnsi="Menlo" w:cs="Menlo"/>
+          <w:color w:val="CCCCCC"/>
+          <w:kern w:val="0"/>
+          <w:sz w:val="18"/>
+          <w:szCs w:val="18"/>
+          <w14:ligatures w14:val="none"/>
+        </w:rPr>
+        <w:t xml:space="preserve">    </w:t>
+      </w:r>
+      <w:proofErr w:type="spellStart"/>
+      <w:proofErr w:type="gramStart"/>
+      <w:r>
+        <w:rPr>
+          <w:rFonts w:ascii="Menlo" w:eastAsia="Times New Roman" w:hAnsi="Menlo" w:cs="Menlo"/>
+          <w:color w:val="9CDCFE"/>
+          <w:kern w:val="0"/>
+          <w:sz w:val="18"/>
+          <w:szCs w:val="18"/>
+          <w14:ligatures w14:val="none"/>
+        </w:rPr>
+        <w:t>shape</w:t>
+      </w:r>
+      <w:r>
+        <w:rPr>
+          <w:rFonts w:ascii="Menlo" w:eastAsia="Times New Roman" w:hAnsi="Menlo" w:cs="Menlo"/>
+          <w:color w:val="CCCCCC"/>
+          <w:kern w:val="0"/>
+          <w:sz w:val="18"/>
+          <w:szCs w:val="18"/>
+          <w14:ligatures w14:val="none"/>
+        </w:rPr>
+        <w:t>.</w:t>
+      </w:r>
+      <w:r>
+        <w:rPr>
+          <w:rFonts w:ascii="Menlo" w:eastAsia="Times New Roman" w:hAnsi="Menlo" w:cs="Menlo"/>
+          <w:color w:val="DCDCAA"/>
+          <w:kern w:val="0"/>
+          <w:sz w:val="18"/>
+          <w:szCs w:val="18"/>
+          <w14:ligatures w14:val="none"/>
+        </w:rPr>
+        <w:t>setPosition</w:t>
+      </w:r>
+      <w:proofErr w:type="spellEnd"/>
+      <w:proofErr w:type="gramEnd"/>
+      <w:r>
+        <w:rPr>
+          <w:rFonts w:ascii="Menlo" w:eastAsia="Times New Roman" w:hAnsi="Menlo" w:cs="Menlo"/>
+          <w:color w:val="CCCCCC"/>
+          <w:kern w:val="0"/>
+          <w:sz w:val="18"/>
+          <w:szCs w:val="18"/>
+          <w14:ligatures w14:val="none"/>
+        </w:rPr>
+        <w:t>(</w:t>
+      </w:r>
+      <w:r>
+        <w:rPr>
+          <w:rFonts w:ascii="Menlo" w:eastAsia="Times New Roman" w:hAnsi="Menlo" w:cs="Menlo"/>
+          <w:color w:val="9CDCFE"/>
+          <w:kern w:val="0"/>
+          <w:sz w:val="18"/>
+          <w:szCs w:val="18"/>
+          <w14:ligatures w14:val="none"/>
+        </w:rPr>
+        <w:t>x</w:t>
+      </w:r>
+      <w:r>
+        <w:rPr>
+          <w:rFonts w:ascii="Menlo" w:eastAsia="Times New Roman" w:hAnsi="Menlo" w:cs="Menlo"/>
+          <w:color w:val="CCCCCC"/>
+          <w:kern w:val="0"/>
+          <w:sz w:val="18"/>
+          <w:szCs w:val="18"/>
+          <w14:ligatures w14:val="none"/>
+        </w:rPr>
+        <w:t xml:space="preserve">, </w:t>
+      </w:r>
+      <w:proofErr w:type="spellStart"/>
+      <w:r>
+        <w:rPr>
+          <w:rFonts w:ascii="Menlo" w:eastAsia="Times New Roman" w:hAnsi="Menlo" w:cs="Menlo"/>
+          <w:color w:val="9CDCFE"/>
+          <w:kern w:val="0"/>
+          <w:sz w:val="18"/>
+          <w:szCs w:val="18"/>
+          <w14:ligatures w14:val="none"/>
+        </w:rPr>
+        <w:t>platformTop</w:t>
+      </w:r>
+      <w:proofErr w:type="spellEnd"/>
+      <w:r>
+        <w:rPr>
+          <w:rFonts w:ascii="Menlo" w:eastAsia="Times New Roman" w:hAnsi="Menlo" w:cs="Menlo"/>
+          <w:color w:val="CCCCCC"/>
+          <w:kern w:val="0"/>
+          <w:sz w:val="18"/>
+          <w:szCs w:val="18"/>
+          <w14:ligatures w14:val="none"/>
+        </w:rPr>
+        <w:t xml:space="preserve"> </w:t>
+      </w:r>
+      <w:r>
+        <w:rPr>
+          <w:rFonts w:ascii="Menlo" w:eastAsia="Times New Roman" w:hAnsi="Menlo" w:cs="Menlo"/>
+          <w:color w:val="D4D4D4"/>
+          <w:kern w:val="0"/>
+          <w:sz w:val="18"/>
+          <w:szCs w:val="18"/>
+          <w14:ligatures w14:val="none"/>
+        </w:rPr>
+        <w:t>-</w:t>
+      </w:r>
+      <w:r>
+        <w:rPr>
+          <w:rFonts w:ascii="Menlo" w:eastAsia="Times New Roman" w:hAnsi="Menlo" w:cs="Menlo"/>
+          <w:color w:val="CCCCCC"/>
+          <w:kern w:val="0"/>
+          <w:sz w:val="18"/>
+          <w:szCs w:val="18"/>
+          <w14:ligatures w14:val="none"/>
+        </w:rPr>
+        <w:t xml:space="preserve"> </w:t>
+      </w:r>
+      <w:r>
+        <w:rPr>
+          <w:rFonts w:ascii="Menlo" w:eastAsia="Times New Roman" w:hAnsi="Menlo" w:cs="Menlo"/>
+          <w:color w:val="9CDCFE"/>
+          <w:kern w:val="0"/>
+          <w:sz w:val="18"/>
+          <w:szCs w:val="18"/>
+          <w14:ligatures w14:val="none"/>
+        </w:rPr>
+        <w:t>height</w:t>
+      </w:r>
+      <w:r>
+        <w:rPr>
+          <w:rFonts w:ascii="Menlo" w:eastAsia="Times New Roman" w:hAnsi="Menlo" w:cs="Menlo"/>
+          <w:color w:val="CCCCCC"/>
+          <w:kern w:val="0"/>
+          <w:sz w:val="18"/>
+          <w:szCs w:val="18"/>
+          <w14:ligatures w14:val="none"/>
+        </w:rPr>
+        <w:t>);</w:t>
+      </w:r>
+    </w:p>
+    <w:p>
+      <w:pPr>
+        <w:shd w:val="clear" w:color="auto" w:fill="1F1F1F"/>
+        <w:spacing w:after="0" w:line="270" w:lineRule="atLeast"/>
+        <w:rPr>
+          <w:rFonts w:ascii="Menlo" w:eastAsia="Times New Roman" w:hAnsi="Menlo" w:cs="Menlo"/>
+          <w:color w:val="CCCCCC"/>
+          <w:kern w:val="0"/>
+          <w:sz w:val="18"/>
+          <w:szCs w:val="18"/>
+          <w14:ligatures w14:val="none"/>
+        </w:rPr>
+      </w:pPr>
+    </w:p>
+    <w:p>
+      <w:pPr>
+        <w:shd w:val="clear" w:color="auto" w:fill="1F1F1F"/>
+        <w:spacing w:after="0" w:line="270" w:lineRule="atLeast"/>
+        <w:rPr>
+          <w:rFonts w:ascii="Menlo" w:eastAsia="Times New Roman" w:hAnsi="Menlo" w:cs="Menlo"/>
+          <w:color w:val="CCCCCC"/>
+          <w:kern w:val="0"/>
+          <w:sz w:val="18"/>
+          <w:szCs w:val="18"/>
+          <w14:ligatures w14:val="none"/>
+        </w:rPr>
+      </w:pPr>
+      <w:r>
+        <w:rPr>
+          <w:rFonts w:ascii="Menlo" w:eastAsia="Times New Roman" w:hAnsi="Menlo" w:cs="Menlo"/>
+          <w:color w:val="CCCCCC"/>
+          <w:kern w:val="0"/>
+          <w:sz w:val="18"/>
+          <w:szCs w:val="18"/>
+          <w14:ligatures w14:val="none"/>
+        </w:rPr>
+        <w:t xml:space="preserve">    </w:t>
+      </w:r>
+      <w:proofErr w:type="spellStart"/>
+      <w:proofErr w:type="gramStart"/>
+      <w:r>
+        <w:rPr>
+          <w:rFonts w:ascii="Menlo" w:eastAsia="Times New Roman" w:hAnsi="Menlo" w:cs="Menlo"/>
+          <w:color w:val="9CDCFE"/>
+          <w:kern w:val="0"/>
+          <w:sz w:val="18"/>
+          <w:szCs w:val="18"/>
+          <w14:ligatures w14:val="none"/>
+        </w:rPr>
+        <w:t>shape</w:t>
+      </w:r>
+      <w:r>
+        <w:rPr>
+          <w:rFonts w:ascii="Menlo" w:eastAsia="Times New Roman" w:hAnsi="Menlo" w:cs="Menlo"/>
+          <w:color w:val="CCCCCC"/>
+          <w:kern w:val="0"/>
+          <w:sz w:val="18"/>
+          <w:szCs w:val="18"/>
+          <w14:ligatures w14:val="none"/>
+        </w:rPr>
+        <w:t>.</w:t>
+      </w:r>
+      <w:r>
+        <w:rPr>
+          <w:rFonts w:ascii="Menlo" w:eastAsia="Times New Roman" w:hAnsi="Menlo" w:cs="Menlo"/>
+          <w:color w:val="DCDCAA"/>
+          <w:kern w:val="0"/>
+          <w:sz w:val="18"/>
+          <w:szCs w:val="18"/>
+          <w14:ligatures w14:val="none"/>
+        </w:rPr>
+        <w:t>setFillColor</w:t>
+      </w:r>
+      <w:proofErr w:type="spellEnd"/>
+      <w:proofErr w:type="gramEnd"/>
+      <w:r>
+        <w:rPr>
+          <w:rFonts w:ascii="Menlo" w:eastAsia="Times New Roman" w:hAnsi="Menlo" w:cs="Menlo"/>
+          <w:color w:val="CCCCCC"/>
+          <w:kern w:val="0"/>
+          <w:sz w:val="18"/>
+          <w:szCs w:val="18"/>
+          <w14:ligatures w14:val="none"/>
+        </w:rPr>
+        <w:t>(</w:t>
+      </w:r>
+      <w:proofErr w:type="gramStart"/>
+      <w:r>
+        <w:rPr>
+          <w:rFonts w:ascii="Menlo" w:eastAsia="Times New Roman" w:hAnsi="Menlo" w:cs="Menlo"/>
+          <w:color w:val="4EC9B0"/>
+          <w:kern w:val="0"/>
+          <w:sz w:val="18"/>
+          <w:szCs w:val="18"/>
+          <w14:ligatures w14:val="none"/>
+        </w:rPr>
+        <w:t>sf</w:t>
+      </w:r>
+      <w:r>
+        <w:rPr>
+          <w:rFonts w:ascii="Menlo" w:eastAsia="Times New Roman" w:hAnsi="Menlo" w:cs="Menlo"/>
+          <w:color w:val="CCCCCC"/>
+          <w:kern w:val="0"/>
+          <w:sz w:val="18"/>
+          <w:szCs w:val="18"/>
+          <w14:ligatures w14:val="none"/>
+        </w:rPr>
+        <w:t>::</w:t>
+      </w:r>
+      <w:r>
+        <w:rPr>
+          <w:rFonts w:ascii="Menlo" w:eastAsia="Times New Roman" w:hAnsi="Menlo" w:cs="Menlo"/>
+          <w:color w:val="4EC9B0"/>
+          <w:kern w:val="0"/>
+          <w:sz w:val="18"/>
+          <w:szCs w:val="18"/>
+          <w14:ligatures w14:val="none"/>
+        </w:rPr>
+        <w:t>Color</w:t>
+      </w:r>
+      <w:r>
+        <w:rPr>
+          <w:rFonts w:ascii="Menlo" w:eastAsia="Times New Roman" w:hAnsi="Menlo" w:cs="Menlo"/>
+          <w:color w:val="CCCCCC"/>
+          <w:kern w:val="0"/>
+          <w:sz w:val="18"/>
+          <w:szCs w:val="18"/>
+          <w14:ligatures w14:val="none"/>
+        </w:rPr>
+        <w:t>::</w:t>
+      </w:r>
+      <w:proofErr w:type="gramEnd"/>
+      <w:r>
+        <w:rPr>
+          <w:rFonts w:ascii="Menlo" w:eastAsia="Times New Roman" w:hAnsi="Menlo" w:cs="Menlo"/>
+          <w:color w:val="CCCCCC"/>
+          <w:kern w:val="0"/>
+          <w:sz w:val="18"/>
+          <w:szCs w:val="18"/>
+          <w14:ligatures w14:val="none"/>
+        </w:rPr>
+        <w:t>Red);</w:t>
+      </w:r>
+    </w:p>
+    <w:p>
+      <w:pPr>
+        <w:shd w:val="clear" w:color="auto" w:fill="1F1F1F"/>
+        <w:spacing w:after="0" w:line="270" w:lineRule="atLeast"/>
+        <w:rPr>
+          <w:rFonts w:ascii="Menlo" w:eastAsia="Times New Roman" w:hAnsi="Menlo" w:cs="Menlo"/>
+          <w:color w:val="CCCCCC"/>
+          <w:kern w:val="0"/>
+          <w:sz w:val="18"/>
+          <w:szCs w:val="18"/>
+          <w14:ligatures w14:val="none"/>
+        </w:rPr>
+      </w:pPr>
+      <w:r>
+        <w:rPr>
+          <w:rFonts w:ascii="Menlo" w:eastAsia="Times New Roman" w:hAnsi="Menlo" w:cs="Menlo"/>
+          <w:color w:val="CCCCCC"/>
+          <w:kern w:val="0"/>
+          <w:sz w:val="18"/>
+          <w:szCs w:val="18"/>
+          <w14:ligatures w14:val="none"/>
+        </w:rPr>
+        <w:t>}</w:t>
+      </w:r>
+    </w:p>
+    <w:p/>
+    <w:p>
+      <w:r>
+        <w:t>Next, player death and restart will be implemented.</w:t>
+      </w:r>
+    </w:p>
+    <w:p/>
+    <w:p>
+      <w:r>
+        <w:t>August 5: Stage 6</w:t>
+      </w:r>
+    </w:p>
+    <w:p>
+      <w:r>
+        <w:t>Player class will be responsible for death/restart mechanics, instead of Main.</w:t>
+      </w:r>
+    </w:p>
+    <w:p>
+      <w:pPr>
+        <w:spacing w:before="100" w:beforeAutospacing="1" w:after="100" w:afterAutospacing="1" w:line="240" w:lineRule="auto"/>
+        <w:rPr>
+          <w:rFonts w:ascii="Times New Roman" w:eastAsia="Times New Roman" w:hAnsi="Times New Roman" w:cs="Times New Roman"/>
+          <w:kern w:val="0"/>
+          <w14:ligatures w14:val="none"/>
+        </w:rPr>
+      </w:pPr>
+      <w:r>
+        <w:t xml:space="preserve">Pressing R respawns the player. Death stops movement of player, </w:t>
+      </w:r>
+      <w:r>
+        <w:rPr>
+          <w:rFonts w:ascii="Times New Roman" w:eastAsia="Times New Roman" w:hAnsi="Times New Roman" w:cs="Times New Roman"/>
+          <w:kern w:val="0"/>
+          <w14:ligatures w14:val="none"/>
+        </w:rPr>
+        <w:t>Reset restores position, velocity, rotation, and color</w:t>
+      </w:r>
+    </w:p>
+    <w:p/>
+    <w:p>
+      <w:r>
+        <w:t>New variable in player:</w:t>
+      </w:r>
+    </w:p>
+    <w:p>
+      <w:pPr>
+        <w:tabs>
+          <w:tab w:val="left" w:pos="916"/>
+          <w:tab w:val="left" w:pos="1832"/>
+          <w:tab w:val="left" w:pos="2748"/>
+          <w:tab w:val="left" w:pos="3664"/>
+          <w:tab w:val="left" w:pos="4580"/>
+          <w:tab w:val="left" w:pos="5496"/>
+          <w:tab w:val="left" w:pos="6412"/>
+          <w:tab w:val="left" w:pos="7328"/>
+          <w:tab w:val="left" w:pos="8244"/>
+          <w:tab w:val="left" w:pos="9160"/>
+          <w:tab w:val="left" w:pos="10076"/>
+          <w:tab w:val="left" w:pos="10992"/>
+          <w:tab w:val="left" w:pos="11908"/>
+          <w:tab w:val="left" w:pos="12824"/>
+          <w:tab w:val="left" w:pos="13740"/>
+          <w:tab w:val="left" w:pos="14656"/>
+        </w:tabs>
+        <w:spacing w:after="0" w:line="240" w:lineRule="auto"/>
+        <w:rPr>
+          <w:rFonts w:ascii="Courier New" w:eastAsia="Times New Roman" w:hAnsi="Courier New" w:cs="Courier New"/>
+          <w:kern w:val="0"/>
+          <w:sz w:val="20"/>
+          <w:szCs w:val="20"/>
+          <w14:ligatures w14:val="none"/>
+        </w:rPr>
+      </w:pPr>
+      <w:r>
+        <w:rPr>
+          <w:rFonts w:ascii="Courier New" w:eastAsia="Times New Roman" w:hAnsi="Courier New" w:cs="Courier New"/>
+          <w:kern w:val="0"/>
+          <w:sz w:val="20"/>
+          <w:szCs w:val="20"/>
+          <w14:ligatures w14:val="none"/>
+        </w:rPr>
+        <w:t>bool alive;</w:t>
+      </w:r>
+    </w:p>
+    <w:p>
+      <w:pPr>
+        <w:spacing w:before="100" w:beforeAutospacing="1" w:after="100" w:afterAutospacing="1" w:line="240" w:lineRule="auto"/>
+        <w:rPr>
+          <w:rFonts w:ascii="Times New Roman" w:eastAsia="Times New Roman" w:hAnsi="Times New Roman" w:cs="Times New Roman"/>
+          <w:kern w:val="0"/>
+          <w14:ligatures w14:val="none"/>
+        </w:rPr>
+      </w:pPr>
+      <w:r>
+        <w:rPr>
+          <w:rFonts w:ascii="Times New Roman" w:eastAsia="Times New Roman" w:hAnsi="Times New Roman" w:cs="Times New Roman"/>
+          <w:kern w:val="0"/>
+          <w14:ligatures w14:val="none"/>
+        </w:rPr>
+        <w:t>New functions:</w:t>
+      </w:r>
+    </w:p>
+    <w:p>
+      <w:pPr>
+        <w:tabs>
+          <w:tab w:val="left" w:pos="916"/>
+          <w:tab w:val="left" w:pos="1832"/>
+          <w:tab w:val="left" w:pos="2748"/>
+          <w:tab w:val="left" w:pos="3664"/>
+          <w:tab w:val="left" w:pos="4580"/>
+          <w:tab w:val="left" w:pos="5496"/>
+          <w:tab w:val="left" w:pos="6412"/>
+          <w:tab w:val="left" w:pos="7328"/>
+          <w:tab w:val="left" w:pos="8244"/>
+          <w:tab w:val="left" w:pos="9160"/>
+          <w:tab w:val="left" w:pos="10076"/>
+          <w:tab w:val="left" w:pos="10992"/>
+          <w:tab w:val="left" w:pos="11908"/>
+          <w:tab w:val="left" w:pos="12824"/>
+          <w:tab w:val="left" w:pos="13740"/>
+          <w:tab w:val="left" w:pos="14656"/>
+        </w:tabs>
+        <w:spacing w:after="0" w:line="240" w:lineRule="auto"/>
+        <w:rPr>
+          <w:rFonts w:ascii="Courier New" w:eastAsia="Times New Roman" w:hAnsi="Courier New" w:cs="Courier New"/>
+          <w:kern w:val="0"/>
+          <w:sz w:val="20"/>
+          <w:szCs w:val="20"/>
+          <w14:ligatures w14:val="none"/>
+        </w:rPr>
+      </w:pPr>
+      <w:r>
+        <w:rPr>
+          <w:rFonts w:ascii="Courier New" w:eastAsia="Times New Roman" w:hAnsi="Courier New" w:cs="Courier New"/>
+          <w:kern w:val="0"/>
+          <w:sz w:val="20"/>
+          <w:szCs w:val="20"/>
+          <w14:ligatures w14:val="none"/>
+        </w:rPr>
+        <w:t xml:space="preserve">void </w:t>
+      </w:r>
+      <w:proofErr w:type="gramStart"/>
+      <w:r>
+        <w:rPr>
+          <w:rFonts w:ascii="Courier New" w:eastAsia="Times New Roman" w:hAnsi="Courier New" w:cs="Courier New"/>
+          <w:kern w:val="0"/>
+          <w:sz w:val="20"/>
+          <w:szCs w:val="20"/>
+          <w14:ligatures w14:val="none"/>
+        </w:rPr>
+        <w:t>die(</w:t>
+      </w:r>
+      <w:proofErr w:type="gramEnd"/>
+      <w:r>
+        <w:rPr>
+          <w:rFonts w:ascii="Courier New" w:eastAsia="Times New Roman" w:hAnsi="Courier New" w:cs="Courier New"/>
+          <w:kern w:val="0"/>
+          <w:sz w:val="20"/>
+          <w:szCs w:val="20"/>
+          <w14:ligatures w14:val="none"/>
+        </w:rPr>
+        <w:t>);</w:t>
+      </w:r>
+    </w:p>
+    <w:p>
+      <w:pPr>
+        <w:tabs>
+          <w:tab w:val="left" w:pos="916"/>
+          <w:tab w:val="left" w:pos="1832"/>
+          <w:tab w:val="left" w:pos="2748"/>
+          <w:tab w:val="left" w:pos="3664"/>
+          <w:tab w:val="left" w:pos="4580"/>
+          <w:tab w:val="left" w:pos="5496"/>
+          <w:tab w:val="left" w:pos="6412"/>
+          <w:tab w:val="left" w:pos="7328"/>
+          <w:tab w:val="left" w:pos="8244"/>
+          <w:tab w:val="left" w:pos="9160"/>
+          <w:tab w:val="left" w:pos="10076"/>
+          <w:tab w:val="left" w:pos="10992"/>
+          <w:tab w:val="left" w:pos="11908"/>
+          <w:tab w:val="left" w:pos="12824"/>
+          <w:tab w:val="left" w:pos="13740"/>
+          <w:tab w:val="left" w:pos="14656"/>
+        </w:tabs>
+        <w:spacing w:after="0" w:line="240" w:lineRule="auto"/>
+        <w:rPr>
+          <w:rFonts w:ascii="Courier New" w:eastAsia="Times New Roman" w:hAnsi="Courier New" w:cs="Courier New"/>
+          <w:kern w:val="0"/>
+          <w:sz w:val="20"/>
+          <w:szCs w:val="20"/>
+          <w14:ligatures w14:val="none"/>
+        </w:rPr>
+      </w:pPr>
+      <w:r>
+        <w:rPr>
+          <w:rFonts w:ascii="Courier New" w:eastAsia="Times New Roman" w:hAnsi="Courier New" w:cs="Courier New"/>
+          <w:kern w:val="0"/>
+          <w:sz w:val="20"/>
+          <w:szCs w:val="20"/>
+          <w14:ligatures w14:val="none"/>
+        </w:rPr>
+        <w:t xml:space="preserve">void </w:t>
+      </w:r>
+      <w:proofErr w:type="gramStart"/>
+      <w:r>
+        <w:rPr>
+          <w:rFonts w:ascii="Courier New" w:eastAsia="Times New Roman" w:hAnsi="Courier New" w:cs="Courier New"/>
+          <w:kern w:val="0"/>
+          <w:sz w:val="20"/>
+          <w:szCs w:val="20"/>
+          <w14:ligatures w14:val="none"/>
+        </w:rPr>
+        <w:t>reset(</w:t>
+      </w:r>
+      <w:proofErr w:type="gramEnd"/>
+      <w:r>
+        <w:rPr>
+          <w:rFonts w:ascii="Courier New" w:eastAsia="Times New Roman" w:hAnsi="Courier New" w:cs="Courier New"/>
+          <w:kern w:val="0"/>
+          <w:sz w:val="20"/>
+          <w:szCs w:val="20"/>
+          <w14:ligatures w14:val="none"/>
+        </w:rPr>
+        <w:t>);</w:t>
+      </w:r>
+    </w:p>
+    <w:p>
+      <w:pPr>
+        <w:tabs>
+          <w:tab w:val="left" w:pos="916"/>
+          <w:tab w:val="left" w:pos="1832"/>
+          <w:tab w:val="left" w:pos="2748"/>
+          <w:tab w:val="left" w:pos="3664"/>
+          <w:tab w:val="left" w:pos="4580"/>
+          <w:tab w:val="left" w:pos="5496"/>
+          <w:tab w:val="left" w:pos="6412"/>
+          <w:tab w:val="left" w:pos="7328"/>
+          <w:tab w:val="left" w:pos="8244"/>
+          <w:tab w:val="left" w:pos="9160"/>
+          <w:tab w:val="left" w:pos="10076"/>
+          <w:tab w:val="left" w:pos="10992"/>
+          <w:tab w:val="left" w:pos="11908"/>
+          <w:tab w:val="left" w:pos="12824"/>
+          <w:tab w:val="left" w:pos="13740"/>
+          <w:tab w:val="left" w:pos="14656"/>
+        </w:tabs>
+        <w:spacing w:after="0" w:line="240" w:lineRule="auto"/>
+        <w:rPr>
+          <w:rFonts w:ascii="Courier New" w:eastAsia="Times New Roman" w:hAnsi="Courier New" w:cs="Courier New"/>
+          <w:kern w:val="0"/>
+          <w:sz w:val="20"/>
+          <w:szCs w:val="20"/>
+          <w14:ligatures w14:val="none"/>
+        </w:rPr>
+      </w:pPr>
+      <w:r>
+        <w:rPr>
+          <w:rFonts w:ascii="Courier New" w:eastAsia="Times New Roman" w:hAnsi="Courier New" w:cs="Courier New"/>
+          <w:kern w:val="0"/>
+          <w:sz w:val="20"/>
+          <w:szCs w:val="20"/>
+          <w14:ligatures w14:val="none"/>
+        </w:rPr>
+        <w:t xml:space="preserve">bool </w:t>
+      </w:r>
+      <w:proofErr w:type="spellStart"/>
+      <w:proofErr w:type="gramStart"/>
+      <w:r>
+        <w:rPr>
+          <w:rFonts w:ascii="Courier New" w:eastAsia="Times New Roman" w:hAnsi="Courier New" w:cs="Courier New"/>
+          <w:kern w:val="0"/>
+          <w:sz w:val="20"/>
+          <w:szCs w:val="20"/>
+          <w14:ligatures w14:val="none"/>
+        </w:rPr>
+        <w:t>isAlive</w:t>
+      </w:r>
+      <w:proofErr w:type="spellEnd"/>
+      <w:r>
+        <w:rPr>
+          <w:rFonts w:ascii="Courier New" w:eastAsia="Times New Roman" w:hAnsi="Courier New" w:cs="Courier New"/>
+          <w:kern w:val="0"/>
+          <w:sz w:val="20"/>
+          <w:szCs w:val="20"/>
+          <w14:ligatures w14:val="none"/>
+        </w:rPr>
+        <w:t>(</w:t>
+      </w:r>
+      <w:proofErr w:type="gramEnd"/>
+      <w:r>
+        <w:rPr>
+          <w:rFonts w:ascii="Courier New" w:eastAsia="Times New Roman" w:hAnsi="Courier New" w:cs="Courier New"/>
+          <w:kern w:val="0"/>
+          <w:sz w:val="20"/>
+          <w:szCs w:val="20"/>
+          <w14:ligatures w14:val="none"/>
+        </w:rPr>
+        <w:t>) const;</w:t>
+      </w:r>
+    </w:p>
+    <w:p/>
+    <w:p/>
+    <w:p/>
+    <w:p/>
+    <w:p/>
+    <w:p/>
+    <w:p>
+      <w:r>
+        <w:lastRenderedPageBreak/>
+        <w:t>Stage 7: implement jumping</w:t>
+      </w:r>
+      <w:r>
+        <w:t xml:space="preserve"> </w:t>
+      </w:r>
+    </w:p>
+    <w:p>
+      <w:r>
+        <w:t xml:space="preserve">Implemented in </w:t>
+      </w:r>
+      <w:proofErr w:type="spellStart"/>
+      <w:r>
+        <w:t>Player.h</w:t>
+      </w:r>
+      <w:proofErr w:type="spellEnd"/>
+      <w:r>
+        <w:t xml:space="preserve"> and Player.cpp</w:t>
+      </w:r>
+    </w:p>
+    <w:p>
+      <w:r>
+        <w:t>Press space to jump. Player can only jump when on the ground. Gravity pulls the player down, and lands back on the platform using existing collision detection.</w:t>
+      </w:r>
+    </w:p>
+    <w:p/>
     <w:p/>
     <w:sectPr>
       <w:pgSz w:w="12240" w:h="15840"/>
@@ -8630,6 +10648,155 @@
     </w:lvl>
   </w:abstractNum>
   <w:abstractNum w:abstractNumId="2" w15:restartNumberingAfterBreak="0">
+    <w:nsid w:val="3C0B32AA"/>
+    <w:multiLevelType w:val="multilevel"/>
+    <w:tmpl w:val="DF3C9D14"/>
+    <w:lvl w:ilvl="0">
+      <w:start w:val="1"/>
+      <w:numFmt w:val="bullet"/>
+      <w:lvlText w:val=""/>
+      <w:lvlJc w:val="left"/>
+      <w:pPr>
+        <w:tabs>
+          <w:tab w:val="num" w:pos="720"/>
+        </w:tabs>
+        <w:ind w:left="720" w:hanging="360"/>
+      </w:pPr>
+      <w:rPr>
+        <w:rFonts w:ascii="Symbol" w:hAnsi="Symbol" w:hint="default"/>
+        <w:sz w:val="20"/>
+      </w:rPr>
+    </w:lvl>
+    <w:lvl w:ilvl="1" w:tentative="1">
+      <w:start w:val="1"/>
+      <w:numFmt w:val="bullet"/>
+      <w:lvlText w:val="o"/>
+      <w:lvlJc w:val="left"/>
+      <w:pPr>
+        <w:tabs>
+          <w:tab w:val="num" w:pos="1440"/>
+        </w:tabs>
+        <w:ind w:left="1440" w:hanging="360"/>
+      </w:pPr>
+      <w:rPr>
+        <w:rFonts w:ascii="Courier New" w:hAnsi="Courier New" w:hint="default"/>
+        <w:sz w:val="20"/>
+      </w:rPr>
+    </w:lvl>
+    <w:lvl w:ilvl="2" w:tentative="1">
+      <w:start w:val="1"/>
+      <w:numFmt w:val="bullet"/>
+      <w:lvlText w:val=""/>
+      <w:lvlJc w:val="left"/>
+      <w:pPr>
+        <w:tabs>
+          <w:tab w:val="num" w:pos="2160"/>
+        </w:tabs>
+        <w:ind w:left="2160" w:hanging="360"/>
+      </w:pPr>
+      <w:rPr>
+        <w:rFonts w:ascii="Wingdings" w:hAnsi="Wingdings" w:hint="default"/>
+        <w:sz w:val="20"/>
+      </w:rPr>
+    </w:lvl>
+    <w:lvl w:ilvl="3" w:tentative="1">
+      <w:start w:val="1"/>
+      <w:numFmt w:val="bullet"/>
+      <w:lvlText w:val=""/>
+      <w:lvlJc w:val="left"/>
+      <w:pPr>
+        <w:tabs>
+          <w:tab w:val="num" w:pos="2880"/>
+        </w:tabs>
+        <w:ind w:left="2880" w:hanging="360"/>
+      </w:pPr>
+      <w:rPr>
+        <w:rFonts w:ascii="Wingdings" w:hAnsi="Wingdings" w:hint="default"/>
+        <w:sz w:val="20"/>
+      </w:rPr>
+    </w:lvl>
+    <w:lvl w:ilvl="4" w:tentative="1">
+      <w:start w:val="1"/>
+      <w:numFmt w:val="bullet"/>
+      <w:lvlText w:val=""/>
+      <w:lvlJc w:val="left"/>
+      <w:pPr>
+        <w:tabs>
+          <w:tab w:val="num" w:pos="3600"/>
+        </w:tabs>
+        <w:ind w:left="3600" w:hanging="360"/>
+      </w:pPr>
+      <w:rPr>
+        <w:rFonts w:ascii="Wingdings" w:hAnsi="Wingdings" w:hint="default"/>
+        <w:sz w:val="20"/>
+      </w:rPr>
+    </w:lvl>
+    <w:lvl w:ilvl="5" w:tentative="1">
+      <w:start w:val="1"/>
+      <w:numFmt w:val="bullet"/>
+      <w:lvlText w:val=""/>
+      <w:lvlJc w:val="left"/>
+      <w:pPr>
+        <w:tabs>
+          <w:tab w:val="num" w:pos="4320"/>
+        </w:tabs>
+        <w:ind w:left="4320" w:hanging="360"/>
+      </w:pPr>
+      <w:rPr>
+        <w:rFonts w:ascii="Wingdings" w:hAnsi="Wingdings" w:hint="default"/>
+        <w:sz w:val="20"/>
+      </w:rPr>
+    </w:lvl>
+    <w:lvl w:ilvl="6" w:tentative="1">
+      <w:start w:val="1"/>
+      <w:numFmt w:val="bullet"/>
+      <w:lvlText w:val=""/>
+      <w:lvlJc w:val="left"/>
+      <w:pPr>
+        <w:tabs>
+          <w:tab w:val="num" w:pos="5040"/>
+        </w:tabs>
+        <w:ind w:left="5040" w:hanging="360"/>
+      </w:pPr>
+      <w:rPr>
+        <w:rFonts w:ascii="Wingdings" w:hAnsi="Wingdings" w:hint="default"/>
+        <w:sz w:val="20"/>
+      </w:rPr>
+    </w:lvl>
+    <w:lvl w:ilvl="7" w:tentative="1">
+      <w:start w:val="1"/>
+      <w:numFmt w:val="bullet"/>
+      <w:lvlText w:val=""/>
+      <w:lvlJc w:val="left"/>
+      <w:pPr>
+        <w:tabs>
+          <w:tab w:val="num" w:pos="5760"/>
+        </w:tabs>
+        <w:ind w:left="5760" w:hanging="360"/>
+      </w:pPr>
+      <w:rPr>
+        <w:rFonts w:ascii="Wingdings" w:hAnsi="Wingdings" w:hint="default"/>
+        <w:sz w:val="20"/>
+      </w:rPr>
+    </w:lvl>
+    <w:lvl w:ilvl="8" w:tentative="1">
+      <w:start w:val="1"/>
+      <w:numFmt w:val="bullet"/>
+      <w:lvlText w:val=""/>
+      <w:lvlJc w:val="left"/>
+      <w:pPr>
+        <w:tabs>
+          <w:tab w:val="num" w:pos="6480"/>
+        </w:tabs>
+        <w:ind w:left="6480" w:hanging="360"/>
+      </w:pPr>
+      <w:rPr>
+        <w:rFonts w:ascii="Wingdings" w:hAnsi="Wingdings" w:hint="default"/>
+        <w:sz w:val="20"/>
+      </w:rPr>
+    </w:lvl>
+  </w:abstractNum>
+  <w:abstractNum w:abstractNumId="3" w15:restartNumberingAfterBreak="0">
     <w:nsid w:val="589C199E"/>
     <w:multiLevelType w:val="hybridMultilevel"/>
     <w:tmpl w:val="FD86A1B8"/>
@@ -8741,14 +10908,169 @@
       </w:rPr>
     </w:lvl>
   </w:abstractNum>
+  <w:abstractNum w:abstractNumId="4" w15:restartNumberingAfterBreak="0">
+    <w:nsid w:val="76FE3FE4"/>
+    <w:multiLevelType w:val="multilevel"/>
+    <w:tmpl w:val="833623C8"/>
+    <w:lvl w:ilvl="0">
+      <w:start w:val="1"/>
+      <w:numFmt w:val="bullet"/>
+      <w:lvlText w:val=""/>
+      <w:lvlJc w:val="left"/>
+      <w:pPr>
+        <w:tabs>
+          <w:tab w:val="num" w:pos="720"/>
+        </w:tabs>
+        <w:ind w:left="720" w:hanging="360"/>
+      </w:pPr>
+      <w:rPr>
+        <w:rFonts w:ascii="Symbol" w:hAnsi="Symbol" w:hint="default"/>
+        <w:sz w:val="20"/>
+      </w:rPr>
+    </w:lvl>
+    <w:lvl w:ilvl="1" w:tentative="1">
+      <w:start w:val="1"/>
+      <w:numFmt w:val="bullet"/>
+      <w:lvlText w:val="o"/>
+      <w:lvlJc w:val="left"/>
+      <w:pPr>
+        <w:tabs>
+          <w:tab w:val="num" w:pos="1440"/>
+        </w:tabs>
+        <w:ind w:left="1440" w:hanging="360"/>
+      </w:pPr>
+      <w:rPr>
+        <w:rFonts w:ascii="Courier New" w:hAnsi="Courier New" w:hint="default"/>
+        <w:sz w:val="20"/>
+      </w:rPr>
+    </w:lvl>
+    <w:lvl w:ilvl="2" w:tentative="1">
+      <w:start w:val="1"/>
+      <w:numFmt w:val="bullet"/>
+      <w:lvlText w:val=""/>
+      <w:lvlJc w:val="left"/>
+      <w:pPr>
+        <w:tabs>
+          <w:tab w:val="num" w:pos="2160"/>
+        </w:tabs>
+        <w:ind w:left="2160" w:hanging="360"/>
+      </w:pPr>
+      <w:rPr>
+        <w:rFonts w:ascii="Wingdings" w:hAnsi="Wingdings" w:hint="default"/>
+        <w:sz w:val="20"/>
+      </w:rPr>
+    </w:lvl>
+    <w:lvl w:ilvl="3" w:tentative="1">
+      <w:start w:val="1"/>
+      <w:numFmt w:val="bullet"/>
+      <w:lvlText w:val=""/>
+      <w:lvlJc w:val="left"/>
+      <w:pPr>
+        <w:tabs>
+          <w:tab w:val="num" w:pos="2880"/>
+        </w:tabs>
+        <w:ind w:left="2880" w:hanging="360"/>
+      </w:pPr>
+      <w:rPr>
+        <w:rFonts w:ascii="Wingdings" w:hAnsi="Wingdings" w:hint="default"/>
+        <w:sz w:val="20"/>
+      </w:rPr>
+    </w:lvl>
+    <w:lvl w:ilvl="4" w:tentative="1">
+      <w:start w:val="1"/>
+      <w:numFmt w:val="bullet"/>
+      <w:lvlText w:val=""/>
+      <w:lvlJc w:val="left"/>
+      <w:pPr>
+        <w:tabs>
+          <w:tab w:val="num" w:pos="3600"/>
+        </w:tabs>
+        <w:ind w:left="3600" w:hanging="360"/>
+      </w:pPr>
+      <w:rPr>
+        <w:rFonts w:ascii="Wingdings" w:hAnsi="Wingdings" w:hint="default"/>
+        <w:sz w:val="20"/>
+      </w:rPr>
+    </w:lvl>
+    <w:lvl w:ilvl="5" w:tentative="1">
+      <w:start w:val="1"/>
+      <w:numFmt w:val="bullet"/>
+      <w:lvlText w:val=""/>
+      <w:lvlJc w:val="left"/>
+      <w:pPr>
+        <w:tabs>
+          <w:tab w:val="num" w:pos="4320"/>
+        </w:tabs>
+        <w:ind w:left="4320" w:hanging="360"/>
+      </w:pPr>
+      <w:rPr>
+        <w:rFonts w:ascii="Wingdings" w:hAnsi="Wingdings" w:hint="default"/>
+        <w:sz w:val="20"/>
+      </w:rPr>
+    </w:lvl>
+    <w:lvl w:ilvl="6" w:tentative="1">
+      <w:start w:val="1"/>
+      <w:numFmt w:val="bullet"/>
+      <w:lvlText w:val=""/>
+      <w:lvlJc w:val="left"/>
+      <w:pPr>
+        <w:tabs>
+          <w:tab w:val="num" w:pos="5040"/>
+        </w:tabs>
+        <w:ind w:left="5040" w:hanging="360"/>
+      </w:pPr>
+      <w:rPr>
+        <w:rFonts w:ascii="Wingdings" w:hAnsi="Wingdings" w:hint="default"/>
+        <w:sz w:val="20"/>
+      </w:rPr>
+    </w:lvl>
+    <w:lvl w:ilvl="7" w:tentative="1">
+      <w:start w:val="1"/>
+      <w:numFmt w:val="bullet"/>
+      <w:lvlText w:val=""/>
+      <w:lvlJc w:val="left"/>
+      <w:pPr>
+        <w:tabs>
+          <w:tab w:val="num" w:pos="5760"/>
+        </w:tabs>
+        <w:ind w:left="5760" w:hanging="360"/>
+      </w:pPr>
+      <w:rPr>
+        <w:rFonts w:ascii="Wingdings" w:hAnsi="Wingdings" w:hint="default"/>
+        <w:sz w:val="20"/>
+      </w:rPr>
+    </w:lvl>
+    <w:lvl w:ilvl="8" w:tentative="1">
+      <w:start w:val="1"/>
+      <w:numFmt w:val="bullet"/>
+      <w:lvlText w:val=""/>
+      <w:lvlJc w:val="left"/>
+      <w:pPr>
+        <w:tabs>
+          <w:tab w:val="num" w:pos="6480"/>
+        </w:tabs>
+        <w:ind w:left="6480" w:hanging="360"/>
+      </w:pPr>
+      <w:rPr>
+        <w:rFonts w:ascii="Wingdings" w:hAnsi="Wingdings" w:hint="default"/>
+        <w:sz w:val="20"/>
+      </w:rPr>
+    </w:lvl>
+  </w:abstractNum>
   <w:num w:numId="1" w16cid:durableId="700977380">
     <w:abstractNumId w:val="0"/>
   </w:num>
   <w:num w:numId="2" w16cid:durableId="1628196754">
-    <w:abstractNumId w:val="2"/>
+    <w:abstractNumId w:val="3"/>
   </w:num>
   <w:num w:numId="3" w16cid:durableId="1903901708">
     <w:abstractNumId w:val="1"/>
+  </w:num>
+  <w:num w:numId="4" w16cid:durableId="355082902">
+    <w:abstractNumId w:val="4"/>
+  </w:num>
+  <w:num w:numId="5" w16cid:durableId="1088038182">
+    <w:abstractNumId w:val="2"/>
   </w:num>
 </w:numbering>
 </file>

</xml_diff>

<commit_message>
Stage 8: Multiple platforms using std::vector
</commit_message>
<xml_diff>
--- a/development log.docx
+++ b/development log.docx
@@ -10388,7 +10388,144 @@
       </w:r>
     </w:p>
     <w:p/>
-    <w:p/>
+    <w:p>
+      <w:r>
+        <w:t xml:space="preserve">Stage 8: Multiple platforms using </w:t>
+      </w:r>
+      <w:proofErr w:type="gramStart"/>
+      <w:r>
+        <w:t>std::</w:t>
+      </w:r>
+      <w:proofErr w:type="gramEnd"/>
+      <w:r>
+        <w:t>vector</w:t>
+      </w:r>
+    </w:p>
+    <w:p>
+      <w:r>
+        <w:t xml:space="preserve">Replaced the single ground object with </w:t>
+      </w:r>
+    </w:p>
+    <w:p>
+      <w:pPr>
+        <w:shd w:val="clear" w:color="auto" w:fill="1F1F1F"/>
+        <w:spacing w:after="0" w:line="270" w:lineRule="atLeast"/>
+        <w:rPr>
+          <w:rFonts w:ascii="Menlo" w:eastAsia="Times New Roman" w:hAnsi="Menlo" w:cs="Menlo"/>
+          <w:color w:val="CCCCCC"/>
+          <w:kern w:val="0"/>
+          <w:sz w:val="18"/>
+          <w:szCs w:val="18"/>
+          <w14:ligatures w14:val="none"/>
+        </w:rPr>
+      </w:pPr>
+      <w:proofErr w:type="gramStart"/>
+      <w:r>
+        <w:rPr>
+          <w:rFonts w:ascii="Menlo" w:eastAsia="Times New Roman" w:hAnsi="Menlo" w:cs="Menlo"/>
+          <w:color w:val="4EC9B0"/>
+          <w:kern w:val="0"/>
+          <w:sz w:val="18"/>
+          <w:szCs w:val="18"/>
+          <w14:ligatures w14:val="none"/>
+        </w:rPr>
+        <w:t>std</w:t>
+      </w:r>
+      <w:r>
+        <w:rPr>
+          <w:rFonts w:ascii="Menlo" w:eastAsia="Times New Roman" w:hAnsi="Menlo" w:cs="Menlo"/>
+          <w:color w:val="CCCCCC"/>
+          <w:kern w:val="0"/>
+          <w:sz w:val="18"/>
+          <w:szCs w:val="18"/>
+          <w14:ligatures w14:val="none"/>
+        </w:rPr>
+        <w:t>::</w:t>
+      </w:r>
+      <w:proofErr w:type="gramEnd"/>
+      <w:r>
+        <w:rPr>
+          <w:rFonts w:ascii="Menlo" w:eastAsia="Times New Roman" w:hAnsi="Menlo" w:cs="Menlo"/>
+          <w:color w:val="4EC9B0"/>
+          <w:kern w:val="0"/>
+          <w:sz w:val="18"/>
+          <w:szCs w:val="18"/>
+          <w14:ligatures w14:val="none"/>
+        </w:rPr>
+        <w:t>vector</w:t>
+      </w:r>
+      <w:r>
+        <w:rPr>
+          <w:rFonts w:ascii="Menlo" w:eastAsia="Times New Roman" w:hAnsi="Menlo" w:cs="Menlo"/>
+          <w:color w:val="D4D4D4"/>
+          <w:kern w:val="0"/>
+          <w:sz w:val="18"/>
+          <w:szCs w:val="18"/>
+          <w14:ligatures w14:val="none"/>
+        </w:rPr>
+        <w:t>&lt;</w:t>
+      </w:r>
+      <w:r>
+        <w:rPr>
+          <w:rFonts w:ascii="Menlo" w:eastAsia="Times New Roman" w:hAnsi="Menlo" w:cs="Menlo"/>
+          <w:color w:val="4EC9B0"/>
+          <w:kern w:val="0"/>
+          <w:sz w:val="18"/>
+          <w:szCs w:val="18"/>
+          <w14:ligatures w14:val="none"/>
+        </w:rPr>
+        <w:t>Platform</w:t>
+      </w:r>
+      <w:r>
+        <w:rPr>
+          <w:rFonts w:ascii="Menlo" w:eastAsia="Times New Roman" w:hAnsi="Menlo" w:cs="Menlo"/>
+          <w:color w:val="D4D4D4"/>
+          <w:kern w:val="0"/>
+          <w:sz w:val="18"/>
+          <w:szCs w:val="18"/>
+          <w14:ligatures w14:val="none"/>
+        </w:rPr>
+        <w:t>&gt;</w:t>
+      </w:r>
+      <w:r>
+        <w:rPr>
+          <w:rFonts w:ascii="Menlo" w:eastAsia="Times New Roman" w:hAnsi="Menlo" w:cs="Menlo"/>
+          <w:color w:val="CCCCCC"/>
+          <w:kern w:val="0"/>
+          <w:sz w:val="18"/>
+          <w:szCs w:val="18"/>
+          <w14:ligatures w14:val="none"/>
+        </w:rPr>
+        <w:t xml:space="preserve"> </w:t>
+      </w:r>
+      <w:r>
+        <w:rPr>
+          <w:rFonts w:ascii="Menlo" w:eastAsia="Times New Roman" w:hAnsi="Menlo" w:cs="Menlo"/>
+          <w:color w:val="9CDCFE"/>
+          <w:kern w:val="0"/>
+          <w:sz w:val="18"/>
+          <w:szCs w:val="18"/>
+          <w14:ligatures w14:val="none"/>
+        </w:rPr>
+        <w:t>platforms</w:t>
+      </w:r>
+      <w:r>
+        <w:rPr>
+          <w:rFonts w:ascii="Menlo" w:eastAsia="Times New Roman" w:hAnsi="Menlo" w:cs="Menlo"/>
+          <w:color w:val="CCCCCC"/>
+          <w:kern w:val="0"/>
+          <w:sz w:val="18"/>
+          <w:szCs w:val="18"/>
+          <w14:ligatures w14:val="none"/>
+        </w:rPr>
+        <w:t>;</w:t>
+      </w:r>
+    </w:p>
+    <w:p>
+      <w:r>
+        <w:t>An empty vector capable of storing Platform objects</w:t>
+      </w:r>
+    </w:p>
     <w:sectPr>
       <w:pgSz w:w="12240" w:h="15840"/>
       <w:pgMar w:top="1440" w:right="1440" w:bottom="1440" w:left="1440" w:header="720" w:footer="720" w:gutter="0"/>

</xml_diff>

<commit_message>
Stage 9: camera movement and Stage 10: improved encapsulation using Game.cpp
</commit_message>
<xml_diff>
--- a/development log.docx
+++ b/development log.docx
@@ -8261,7 +8261,7 @@
           <w:noProof/>
         </w:rPr>
         <w:drawing>
-          <wp:anchor distT="0" distB="0" distL="114300" distR="114300" simplePos="0" relativeHeight="251658240" behindDoc="0" locked="0" layoutInCell="1" allowOverlap="1" wp14:anchorId="44CA20CA" wp14:editId="36EC0965">
+          <wp:anchor distT="0" distB="0" distL="114300" distR="114300" simplePos="0" relativeHeight="251658240" behindDoc="0" locked="0" layoutInCell="1" allowOverlap="1" wp14:anchorId="44CA20CA" wp14:editId="2C3AF301">
             <wp:simplePos x="914400" y="3212327"/>
             <wp:positionH relativeFrom="column">
               <wp:align>left</wp:align>
@@ -10524,6 +10524,756 @@
     <w:p>
       <w:r>
         <w:t>An empty vector capable of storing Platform objects</w:t>
+      </w:r>
+    </w:p>
+    <w:p/>
+    <w:p>
+      <w:r>
+        <w:t xml:space="preserve">Stage 9: add camera movement </w:t>
+      </w:r>
+    </w:p>
+    <w:p>
+      <w:r>
+        <w:t>August 10, 2026</w:t>
+      </w:r>
+    </w:p>
+    <w:p>
+      <w:r>
+        <w:t>Main:</w:t>
+      </w:r>
+    </w:p>
+    <w:p>
+      <w:pPr>
+        <w:shd w:val="clear" w:color="auto" w:fill="1F1F1F"/>
+        <w:spacing w:after="0" w:line="270" w:lineRule="atLeast"/>
+        <w:rPr>
+          <w:rFonts w:ascii="Menlo" w:eastAsia="Times New Roman" w:hAnsi="Menlo" w:cs="Menlo"/>
+          <w:color w:val="CCCCCC"/>
+          <w:kern w:val="0"/>
+          <w:sz w:val="18"/>
+          <w:szCs w:val="18"/>
+          <w14:ligatures w14:val="none"/>
+        </w:rPr>
+      </w:pPr>
+      <w:r>
+        <w:rPr>
+          <w:rFonts w:ascii="Menlo" w:eastAsia="Times New Roman" w:hAnsi="Menlo" w:cs="Menlo"/>
+          <w:color w:val="6A9955"/>
+          <w:kern w:val="0"/>
+          <w:sz w:val="18"/>
+          <w:szCs w:val="18"/>
+          <w14:ligatures w14:val="none"/>
+        </w:rPr>
+        <w:t>// Camera movement</w:t>
+      </w:r>
+    </w:p>
+    <w:p>
+      <w:pPr>
+        <w:shd w:val="clear" w:color="auto" w:fill="1F1F1F"/>
+        <w:spacing w:after="0" w:line="270" w:lineRule="atLeast"/>
+        <w:rPr>
+          <w:rFonts w:ascii="Menlo" w:eastAsia="Times New Roman" w:hAnsi="Menlo" w:cs="Menlo"/>
+          <w:color w:val="CCCCCC"/>
+          <w:kern w:val="0"/>
+          <w:sz w:val="18"/>
+          <w:szCs w:val="18"/>
+          <w14:ligatures w14:val="none"/>
+        </w:rPr>
+      </w:pPr>
+      <w:r>
+        <w:rPr>
+          <w:rFonts w:ascii="Menlo" w:eastAsia="Times New Roman" w:hAnsi="Menlo" w:cs="Menlo"/>
+          <w:color w:val="CCCCCC"/>
+          <w:kern w:val="0"/>
+          <w:sz w:val="18"/>
+          <w:szCs w:val="18"/>
+          <w14:ligatures w14:val="none"/>
+        </w:rPr>
+        <w:t xml:space="preserve">        </w:t>
+      </w:r>
+      <w:r>
+        <w:rPr>
+          <w:rFonts w:ascii="Menlo" w:eastAsia="Times New Roman" w:hAnsi="Menlo" w:cs="Menlo"/>
+          <w:color w:val="569CD6"/>
+          <w:kern w:val="0"/>
+          <w:sz w:val="18"/>
+          <w:szCs w:val="18"/>
+          <w14:ligatures w14:val="none"/>
+        </w:rPr>
+        <w:t>float</w:t>
+      </w:r>
+      <w:r>
+        <w:rPr>
+          <w:rFonts w:ascii="Menlo" w:eastAsia="Times New Roman" w:hAnsi="Menlo" w:cs="Menlo"/>
+          <w:color w:val="CCCCCC"/>
+          <w:kern w:val="0"/>
+          <w:sz w:val="18"/>
+          <w:szCs w:val="18"/>
+          <w14:ligatures w14:val="none"/>
+        </w:rPr>
+        <w:t xml:space="preserve"> </w:t>
+      </w:r>
+      <w:proofErr w:type="spellStart"/>
+      <w:r>
+        <w:rPr>
+          <w:rFonts w:ascii="Menlo" w:eastAsia="Times New Roman" w:hAnsi="Menlo" w:cs="Menlo"/>
+          <w:color w:val="9CDCFE"/>
+          <w:kern w:val="0"/>
+          <w:sz w:val="18"/>
+          <w:szCs w:val="18"/>
+          <w14:ligatures w14:val="none"/>
+        </w:rPr>
+        <w:t>cameraX</w:t>
+      </w:r>
+      <w:proofErr w:type="spellEnd"/>
+      <w:r>
+        <w:rPr>
+          <w:rFonts w:ascii="Menlo" w:eastAsia="Times New Roman" w:hAnsi="Menlo" w:cs="Menlo"/>
+          <w:color w:val="CCCCCC"/>
+          <w:kern w:val="0"/>
+          <w:sz w:val="18"/>
+          <w:szCs w:val="18"/>
+          <w14:ligatures w14:val="none"/>
+        </w:rPr>
+        <w:t xml:space="preserve"> </w:t>
+      </w:r>
+      <w:r>
+        <w:rPr>
+          <w:rFonts w:ascii="Menlo" w:eastAsia="Times New Roman" w:hAnsi="Menlo" w:cs="Menlo"/>
+          <w:color w:val="D4D4D4"/>
+          <w:kern w:val="0"/>
+          <w:sz w:val="18"/>
+          <w:szCs w:val="18"/>
+          <w14:ligatures w14:val="none"/>
+        </w:rPr>
+        <w:t>=</w:t>
+      </w:r>
+    </w:p>
+    <w:p>
+      <w:pPr>
+        <w:shd w:val="clear" w:color="auto" w:fill="1F1F1F"/>
+        <w:spacing w:after="0" w:line="270" w:lineRule="atLeast"/>
+        <w:rPr>
+          <w:rFonts w:ascii="Menlo" w:eastAsia="Times New Roman" w:hAnsi="Menlo" w:cs="Menlo"/>
+          <w:color w:val="CCCCCC"/>
+          <w:kern w:val="0"/>
+          <w:sz w:val="18"/>
+          <w:szCs w:val="18"/>
+          <w14:ligatures w14:val="none"/>
+        </w:rPr>
+      </w:pPr>
+      <w:r>
+        <w:rPr>
+          <w:rFonts w:ascii="Menlo" w:eastAsia="Times New Roman" w:hAnsi="Menlo" w:cs="Menlo"/>
+          <w:color w:val="CCCCCC"/>
+          <w:kern w:val="0"/>
+          <w:sz w:val="18"/>
+          <w:szCs w:val="18"/>
+          <w14:ligatures w14:val="none"/>
+        </w:rPr>
+        <w:t xml:space="preserve">            </w:t>
+      </w:r>
+      <w:proofErr w:type="spellStart"/>
+      <w:proofErr w:type="gramStart"/>
+      <w:r>
+        <w:rPr>
+          <w:rFonts w:ascii="Menlo" w:eastAsia="Times New Roman" w:hAnsi="Menlo" w:cs="Menlo"/>
+          <w:color w:val="9CDCFE"/>
+          <w:kern w:val="0"/>
+          <w:sz w:val="18"/>
+          <w:szCs w:val="18"/>
+          <w14:ligatures w14:val="none"/>
+        </w:rPr>
+        <w:t>player</w:t>
+      </w:r>
+      <w:r>
+        <w:rPr>
+          <w:rFonts w:ascii="Menlo" w:eastAsia="Times New Roman" w:hAnsi="Menlo" w:cs="Menlo"/>
+          <w:color w:val="CCCCCC"/>
+          <w:kern w:val="0"/>
+          <w:sz w:val="18"/>
+          <w:szCs w:val="18"/>
+          <w14:ligatures w14:val="none"/>
+        </w:rPr>
+        <w:t>.</w:t>
+      </w:r>
+      <w:r>
+        <w:rPr>
+          <w:rFonts w:ascii="Menlo" w:eastAsia="Times New Roman" w:hAnsi="Menlo" w:cs="Menlo"/>
+          <w:color w:val="DCDCAA"/>
+          <w:kern w:val="0"/>
+          <w:sz w:val="18"/>
+          <w:szCs w:val="18"/>
+          <w14:ligatures w14:val="none"/>
+        </w:rPr>
+        <w:t>getPosition</w:t>
+      </w:r>
+      <w:proofErr w:type="spellEnd"/>
+      <w:proofErr w:type="gramEnd"/>
+      <w:r>
+        <w:rPr>
+          <w:rFonts w:ascii="Menlo" w:eastAsia="Times New Roman" w:hAnsi="Menlo" w:cs="Menlo"/>
+          <w:color w:val="CCCCCC"/>
+          <w:kern w:val="0"/>
+          <w:sz w:val="18"/>
+          <w:szCs w:val="18"/>
+          <w14:ligatures w14:val="none"/>
+        </w:rPr>
+        <w:t>().</w:t>
+      </w:r>
+      <w:r>
+        <w:rPr>
+          <w:rFonts w:ascii="Menlo" w:eastAsia="Times New Roman" w:hAnsi="Menlo" w:cs="Menlo"/>
+          <w:color w:val="9CDCFE"/>
+          <w:kern w:val="0"/>
+          <w:sz w:val="18"/>
+          <w:szCs w:val="18"/>
+          <w14:ligatures w14:val="none"/>
+        </w:rPr>
+        <w:t>x</w:t>
+      </w:r>
+      <w:r>
+        <w:rPr>
+          <w:rFonts w:ascii="Menlo" w:eastAsia="Times New Roman" w:hAnsi="Menlo" w:cs="Menlo"/>
+          <w:color w:val="CCCCCC"/>
+          <w:kern w:val="0"/>
+          <w:sz w:val="18"/>
+          <w:szCs w:val="18"/>
+          <w14:ligatures w14:val="none"/>
+        </w:rPr>
+        <w:t xml:space="preserve"> </w:t>
+      </w:r>
+      <w:r>
+        <w:rPr>
+          <w:rFonts w:ascii="Menlo" w:eastAsia="Times New Roman" w:hAnsi="Menlo" w:cs="Menlo"/>
+          <w:color w:val="D4D4D4"/>
+          <w:kern w:val="0"/>
+          <w:sz w:val="18"/>
+          <w:szCs w:val="18"/>
+          <w14:ligatures w14:val="none"/>
+        </w:rPr>
+        <w:t>+</w:t>
+      </w:r>
+      <w:r>
+        <w:rPr>
+          <w:rFonts w:ascii="Menlo" w:eastAsia="Times New Roman" w:hAnsi="Menlo" w:cs="Menlo"/>
+          <w:color w:val="CCCCCC"/>
+          <w:kern w:val="0"/>
+          <w:sz w:val="18"/>
+          <w:szCs w:val="18"/>
+          <w14:ligatures w14:val="none"/>
+        </w:rPr>
+        <w:t xml:space="preserve"> </w:t>
+      </w:r>
+      <w:r>
+        <w:rPr>
+          <w:rFonts w:ascii="Menlo" w:eastAsia="Times New Roman" w:hAnsi="Menlo" w:cs="Menlo"/>
+          <w:color w:val="B5CEA8"/>
+          <w:kern w:val="0"/>
+          <w:sz w:val="18"/>
+          <w:szCs w:val="18"/>
+          <w14:ligatures w14:val="none"/>
+        </w:rPr>
+        <w:t>300.f</w:t>
+      </w:r>
+      <w:r>
+        <w:rPr>
+          <w:rFonts w:ascii="Menlo" w:eastAsia="Times New Roman" w:hAnsi="Menlo" w:cs="Menlo"/>
+          <w:color w:val="CCCCCC"/>
+          <w:kern w:val="0"/>
+          <w:sz w:val="18"/>
+          <w:szCs w:val="18"/>
+          <w14:ligatures w14:val="none"/>
+        </w:rPr>
+        <w:t>;</w:t>
+      </w:r>
+    </w:p>
+    <w:p>
+      <w:pPr>
+        <w:shd w:val="clear" w:color="auto" w:fill="1F1F1F"/>
+        <w:spacing w:after="0" w:line="270" w:lineRule="atLeast"/>
+        <w:rPr>
+          <w:rFonts w:ascii="Menlo" w:eastAsia="Times New Roman" w:hAnsi="Menlo" w:cs="Menlo"/>
+          <w:color w:val="CCCCCC"/>
+          <w:kern w:val="0"/>
+          <w:sz w:val="18"/>
+          <w:szCs w:val="18"/>
+          <w14:ligatures w14:val="none"/>
+        </w:rPr>
+      </w:pPr>
+    </w:p>
+    <w:p>
+      <w:pPr>
+        <w:shd w:val="clear" w:color="auto" w:fill="1F1F1F"/>
+        <w:spacing w:after="0" w:line="270" w:lineRule="atLeast"/>
+        <w:rPr>
+          <w:rFonts w:ascii="Menlo" w:eastAsia="Times New Roman" w:hAnsi="Menlo" w:cs="Menlo"/>
+          <w:color w:val="CCCCCC"/>
+          <w:kern w:val="0"/>
+          <w:sz w:val="18"/>
+          <w:szCs w:val="18"/>
+          <w14:ligatures w14:val="none"/>
+        </w:rPr>
+      </w:pPr>
+      <w:r>
+        <w:rPr>
+          <w:rFonts w:ascii="Menlo" w:eastAsia="Times New Roman" w:hAnsi="Menlo" w:cs="Menlo"/>
+          <w:color w:val="CCCCCC"/>
+          <w:kern w:val="0"/>
+          <w:sz w:val="18"/>
+          <w:szCs w:val="18"/>
+          <w14:ligatures w14:val="none"/>
+        </w:rPr>
+        <w:t xml:space="preserve">        </w:t>
+      </w:r>
+      <w:r>
+        <w:rPr>
+          <w:rFonts w:ascii="Menlo" w:eastAsia="Times New Roman" w:hAnsi="Menlo" w:cs="Menlo"/>
+          <w:color w:val="C586C0"/>
+          <w:kern w:val="0"/>
+          <w:sz w:val="18"/>
+          <w:szCs w:val="18"/>
+          <w14:ligatures w14:val="none"/>
+        </w:rPr>
+        <w:t>if</w:t>
+      </w:r>
+      <w:r>
+        <w:rPr>
+          <w:rFonts w:ascii="Menlo" w:eastAsia="Times New Roman" w:hAnsi="Menlo" w:cs="Menlo"/>
+          <w:color w:val="CCCCCC"/>
+          <w:kern w:val="0"/>
+          <w:sz w:val="18"/>
+          <w:szCs w:val="18"/>
+          <w14:ligatures w14:val="none"/>
+        </w:rPr>
+        <w:t xml:space="preserve"> (</w:t>
+      </w:r>
+      <w:proofErr w:type="spellStart"/>
+      <w:r>
+        <w:rPr>
+          <w:rFonts w:ascii="Menlo" w:eastAsia="Times New Roman" w:hAnsi="Menlo" w:cs="Menlo"/>
+          <w:color w:val="9CDCFE"/>
+          <w:kern w:val="0"/>
+          <w:sz w:val="18"/>
+          <w:szCs w:val="18"/>
+          <w14:ligatures w14:val="none"/>
+        </w:rPr>
+        <w:t>cameraX</w:t>
+      </w:r>
+      <w:proofErr w:type="spellEnd"/>
+      <w:r>
+        <w:rPr>
+          <w:rFonts w:ascii="Menlo" w:eastAsia="Times New Roman" w:hAnsi="Menlo" w:cs="Menlo"/>
+          <w:color w:val="CCCCCC"/>
+          <w:kern w:val="0"/>
+          <w:sz w:val="18"/>
+          <w:szCs w:val="18"/>
+          <w14:ligatures w14:val="none"/>
+        </w:rPr>
+        <w:t xml:space="preserve"> </w:t>
+      </w:r>
+      <w:r>
+        <w:rPr>
+          <w:rFonts w:ascii="Menlo" w:eastAsia="Times New Roman" w:hAnsi="Menlo" w:cs="Menlo"/>
+          <w:color w:val="D4D4D4"/>
+          <w:kern w:val="0"/>
+          <w:sz w:val="18"/>
+          <w:szCs w:val="18"/>
+          <w14:ligatures w14:val="none"/>
+        </w:rPr>
+        <w:t>&lt;</w:t>
+      </w:r>
+      <w:r>
+        <w:rPr>
+          <w:rFonts w:ascii="Menlo" w:eastAsia="Times New Roman" w:hAnsi="Menlo" w:cs="Menlo"/>
+          <w:color w:val="CCCCCC"/>
+          <w:kern w:val="0"/>
+          <w:sz w:val="18"/>
+          <w:szCs w:val="18"/>
+          <w14:ligatures w14:val="none"/>
+        </w:rPr>
+        <w:t xml:space="preserve"> </w:t>
+      </w:r>
+      <w:r>
+        <w:rPr>
+          <w:rFonts w:ascii="Menlo" w:eastAsia="Times New Roman" w:hAnsi="Menlo" w:cs="Menlo"/>
+          <w:color w:val="B5CEA8"/>
+          <w:kern w:val="0"/>
+          <w:sz w:val="18"/>
+          <w:szCs w:val="18"/>
+          <w14:ligatures w14:val="none"/>
+        </w:rPr>
+        <w:t>500.f</w:t>
+      </w:r>
+      <w:r>
+        <w:rPr>
+          <w:rFonts w:ascii="Menlo" w:eastAsia="Times New Roman" w:hAnsi="Menlo" w:cs="Menlo"/>
+          <w:color w:val="CCCCCC"/>
+          <w:kern w:val="0"/>
+          <w:sz w:val="18"/>
+          <w:szCs w:val="18"/>
+          <w14:ligatures w14:val="none"/>
+        </w:rPr>
+        <w:t>) {</w:t>
+      </w:r>
+    </w:p>
+    <w:p>
+      <w:pPr>
+        <w:shd w:val="clear" w:color="auto" w:fill="1F1F1F"/>
+        <w:spacing w:after="0" w:line="270" w:lineRule="atLeast"/>
+        <w:rPr>
+          <w:rFonts w:ascii="Menlo" w:eastAsia="Times New Roman" w:hAnsi="Menlo" w:cs="Menlo"/>
+          <w:color w:val="CCCCCC"/>
+          <w:kern w:val="0"/>
+          <w:sz w:val="18"/>
+          <w:szCs w:val="18"/>
+          <w14:ligatures w14:val="none"/>
+        </w:rPr>
+      </w:pPr>
+      <w:r>
+        <w:rPr>
+          <w:rFonts w:ascii="Menlo" w:eastAsia="Times New Roman" w:hAnsi="Menlo" w:cs="Menlo"/>
+          <w:color w:val="CCCCCC"/>
+          <w:kern w:val="0"/>
+          <w:sz w:val="18"/>
+          <w:szCs w:val="18"/>
+          <w14:ligatures w14:val="none"/>
+        </w:rPr>
+        <w:t xml:space="preserve">            </w:t>
+      </w:r>
+      <w:proofErr w:type="spellStart"/>
+      <w:r>
+        <w:rPr>
+          <w:rFonts w:ascii="Menlo" w:eastAsia="Times New Roman" w:hAnsi="Menlo" w:cs="Menlo"/>
+          <w:color w:val="9CDCFE"/>
+          <w:kern w:val="0"/>
+          <w:sz w:val="18"/>
+          <w:szCs w:val="18"/>
+          <w14:ligatures w14:val="none"/>
+        </w:rPr>
+        <w:t>cameraX</w:t>
+      </w:r>
+      <w:proofErr w:type="spellEnd"/>
+      <w:r>
+        <w:rPr>
+          <w:rFonts w:ascii="Menlo" w:eastAsia="Times New Roman" w:hAnsi="Menlo" w:cs="Menlo"/>
+          <w:color w:val="CCCCCC"/>
+          <w:kern w:val="0"/>
+          <w:sz w:val="18"/>
+          <w:szCs w:val="18"/>
+          <w14:ligatures w14:val="none"/>
+        </w:rPr>
+        <w:t xml:space="preserve"> </w:t>
+      </w:r>
+      <w:r>
+        <w:rPr>
+          <w:rFonts w:ascii="Menlo" w:eastAsia="Times New Roman" w:hAnsi="Menlo" w:cs="Menlo"/>
+          <w:color w:val="D4D4D4"/>
+          <w:kern w:val="0"/>
+          <w:sz w:val="18"/>
+          <w:szCs w:val="18"/>
+          <w14:ligatures w14:val="none"/>
+        </w:rPr>
+        <w:t>=</w:t>
+      </w:r>
+      <w:r>
+        <w:rPr>
+          <w:rFonts w:ascii="Menlo" w:eastAsia="Times New Roman" w:hAnsi="Menlo" w:cs="Menlo"/>
+          <w:color w:val="CCCCCC"/>
+          <w:kern w:val="0"/>
+          <w:sz w:val="18"/>
+          <w:szCs w:val="18"/>
+          <w14:ligatures w14:val="none"/>
+        </w:rPr>
+        <w:t xml:space="preserve"> </w:t>
+      </w:r>
+      <w:r>
+        <w:rPr>
+          <w:rFonts w:ascii="Menlo" w:eastAsia="Times New Roman" w:hAnsi="Menlo" w:cs="Menlo"/>
+          <w:color w:val="B5CEA8"/>
+          <w:kern w:val="0"/>
+          <w:sz w:val="18"/>
+          <w:szCs w:val="18"/>
+          <w14:ligatures w14:val="none"/>
+        </w:rPr>
+        <w:t>500.f</w:t>
+      </w:r>
+      <w:r>
+        <w:rPr>
+          <w:rFonts w:ascii="Menlo" w:eastAsia="Times New Roman" w:hAnsi="Menlo" w:cs="Menlo"/>
+          <w:color w:val="CCCCCC"/>
+          <w:kern w:val="0"/>
+          <w:sz w:val="18"/>
+          <w:szCs w:val="18"/>
+          <w14:ligatures w14:val="none"/>
+        </w:rPr>
+        <w:t>;</w:t>
+      </w:r>
+    </w:p>
+    <w:p>
+      <w:pPr>
+        <w:shd w:val="clear" w:color="auto" w:fill="1F1F1F"/>
+        <w:spacing w:after="0" w:line="270" w:lineRule="atLeast"/>
+        <w:rPr>
+          <w:rFonts w:ascii="Menlo" w:eastAsia="Times New Roman" w:hAnsi="Menlo" w:cs="Menlo"/>
+          <w:color w:val="CCCCCC"/>
+          <w:kern w:val="0"/>
+          <w:sz w:val="18"/>
+          <w:szCs w:val="18"/>
+          <w14:ligatures w14:val="none"/>
+        </w:rPr>
+      </w:pPr>
+      <w:r>
+        <w:rPr>
+          <w:rFonts w:ascii="Menlo" w:eastAsia="Times New Roman" w:hAnsi="Menlo" w:cs="Menlo"/>
+          <w:color w:val="CCCCCC"/>
+          <w:kern w:val="0"/>
+          <w:sz w:val="18"/>
+          <w:szCs w:val="18"/>
+          <w14:ligatures w14:val="none"/>
+        </w:rPr>
+        <w:t xml:space="preserve">        }</w:t>
+      </w:r>
+    </w:p>
+    <w:p>
+      <w:pPr>
+        <w:shd w:val="clear" w:color="auto" w:fill="1F1F1F"/>
+        <w:spacing w:after="0" w:line="270" w:lineRule="atLeast"/>
+        <w:rPr>
+          <w:rFonts w:ascii="Menlo" w:eastAsia="Times New Roman" w:hAnsi="Menlo" w:cs="Menlo"/>
+          <w:color w:val="CCCCCC"/>
+          <w:kern w:val="0"/>
+          <w:sz w:val="18"/>
+          <w:szCs w:val="18"/>
+          <w14:ligatures w14:val="none"/>
+        </w:rPr>
+      </w:pPr>
+    </w:p>
+    <w:p>
+      <w:pPr>
+        <w:shd w:val="clear" w:color="auto" w:fill="1F1F1F"/>
+        <w:spacing w:after="0" w:line="270" w:lineRule="atLeast"/>
+        <w:rPr>
+          <w:rFonts w:ascii="Menlo" w:eastAsia="Times New Roman" w:hAnsi="Menlo" w:cs="Menlo"/>
+          <w:color w:val="CCCCCC"/>
+          <w:kern w:val="0"/>
+          <w:sz w:val="18"/>
+          <w:szCs w:val="18"/>
+          <w14:ligatures w14:val="none"/>
+        </w:rPr>
+      </w:pPr>
+      <w:r>
+        <w:rPr>
+          <w:rFonts w:ascii="Menlo" w:eastAsia="Times New Roman" w:hAnsi="Menlo" w:cs="Menlo"/>
+          <w:color w:val="CCCCCC"/>
+          <w:kern w:val="0"/>
+          <w:sz w:val="18"/>
+          <w:szCs w:val="18"/>
+          <w14:ligatures w14:val="none"/>
+        </w:rPr>
+        <w:t xml:space="preserve">        </w:t>
+      </w:r>
+      <w:proofErr w:type="spellStart"/>
+      <w:proofErr w:type="gramStart"/>
+      <w:r>
+        <w:rPr>
+          <w:rFonts w:ascii="Menlo" w:eastAsia="Times New Roman" w:hAnsi="Menlo" w:cs="Menlo"/>
+          <w:color w:val="9CDCFE"/>
+          <w:kern w:val="0"/>
+          <w:sz w:val="18"/>
+          <w:szCs w:val="18"/>
+          <w14:ligatures w14:val="none"/>
+        </w:rPr>
+        <w:t>camera</w:t>
+      </w:r>
+      <w:r>
+        <w:rPr>
+          <w:rFonts w:ascii="Menlo" w:eastAsia="Times New Roman" w:hAnsi="Menlo" w:cs="Menlo"/>
+          <w:color w:val="CCCCCC"/>
+          <w:kern w:val="0"/>
+          <w:sz w:val="18"/>
+          <w:szCs w:val="18"/>
+          <w14:ligatures w14:val="none"/>
+        </w:rPr>
+        <w:t>.</w:t>
+      </w:r>
+      <w:r>
+        <w:rPr>
+          <w:rFonts w:ascii="Menlo" w:eastAsia="Times New Roman" w:hAnsi="Menlo" w:cs="Menlo"/>
+          <w:color w:val="DCDCAA"/>
+          <w:kern w:val="0"/>
+          <w:sz w:val="18"/>
+          <w:szCs w:val="18"/>
+          <w14:ligatures w14:val="none"/>
+        </w:rPr>
+        <w:t>setCenter</w:t>
+      </w:r>
+      <w:proofErr w:type="spellEnd"/>
+      <w:proofErr w:type="gramEnd"/>
+      <w:r>
+        <w:rPr>
+          <w:rFonts w:ascii="Menlo" w:eastAsia="Times New Roman" w:hAnsi="Menlo" w:cs="Menlo"/>
+          <w:color w:val="CCCCCC"/>
+          <w:kern w:val="0"/>
+          <w:sz w:val="18"/>
+          <w:szCs w:val="18"/>
+          <w14:ligatures w14:val="none"/>
+        </w:rPr>
+        <w:t>(</w:t>
+      </w:r>
+    </w:p>
+    <w:p>
+      <w:pPr>
+        <w:shd w:val="clear" w:color="auto" w:fill="1F1F1F"/>
+        <w:spacing w:after="0" w:line="270" w:lineRule="atLeast"/>
+        <w:rPr>
+          <w:rFonts w:ascii="Menlo" w:eastAsia="Times New Roman" w:hAnsi="Menlo" w:cs="Menlo"/>
+          <w:color w:val="CCCCCC"/>
+          <w:kern w:val="0"/>
+          <w:sz w:val="18"/>
+          <w:szCs w:val="18"/>
+          <w14:ligatures w14:val="none"/>
+        </w:rPr>
+      </w:pPr>
+      <w:r>
+        <w:rPr>
+          <w:rFonts w:ascii="Menlo" w:eastAsia="Times New Roman" w:hAnsi="Menlo" w:cs="Menlo"/>
+          <w:color w:val="CCCCCC"/>
+          <w:kern w:val="0"/>
+          <w:sz w:val="18"/>
+          <w:szCs w:val="18"/>
+          <w14:ligatures w14:val="none"/>
+        </w:rPr>
+        <w:t xml:space="preserve">            </w:t>
+      </w:r>
+      <w:proofErr w:type="spellStart"/>
+      <w:r>
+        <w:rPr>
+          <w:rFonts w:ascii="Menlo" w:eastAsia="Times New Roman" w:hAnsi="Menlo" w:cs="Menlo"/>
+          <w:color w:val="9CDCFE"/>
+          <w:kern w:val="0"/>
+          <w:sz w:val="18"/>
+          <w:szCs w:val="18"/>
+          <w14:ligatures w14:val="none"/>
+        </w:rPr>
+        <w:t>cameraX</w:t>
+      </w:r>
+      <w:proofErr w:type="spellEnd"/>
+      <w:r>
+        <w:rPr>
+          <w:rFonts w:ascii="Menlo" w:eastAsia="Times New Roman" w:hAnsi="Menlo" w:cs="Menlo"/>
+          <w:color w:val="CCCCCC"/>
+          <w:kern w:val="0"/>
+          <w:sz w:val="18"/>
+          <w:szCs w:val="18"/>
+          <w14:ligatures w14:val="none"/>
+        </w:rPr>
+        <w:t>,</w:t>
+      </w:r>
+    </w:p>
+    <w:p>
+      <w:pPr>
+        <w:shd w:val="clear" w:color="auto" w:fill="1F1F1F"/>
+        <w:spacing w:after="0" w:line="270" w:lineRule="atLeast"/>
+        <w:rPr>
+          <w:rFonts w:ascii="Menlo" w:eastAsia="Times New Roman" w:hAnsi="Menlo" w:cs="Menlo"/>
+          <w:color w:val="CCCCCC"/>
+          <w:kern w:val="0"/>
+          <w:sz w:val="18"/>
+          <w:szCs w:val="18"/>
+          <w14:ligatures w14:val="none"/>
+        </w:rPr>
+      </w:pPr>
+      <w:r>
+        <w:rPr>
+          <w:rFonts w:ascii="Menlo" w:eastAsia="Times New Roman" w:hAnsi="Menlo" w:cs="Menlo"/>
+          <w:color w:val="CCCCCC"/>
+          <w:kern w:val="0"/>
+          <w:sz w:val="18"/>
+          <w:szCs w:val="18"/>
+          <w14:ligatures w14:val="none"/>
+        </w:rPr>
+        <w:t xml:space="preserve">            </w:t>
+      </w:r>
+      <w:r>
+        <w:rPr>
+          <w:rFonts w:ascii="Menlo" w:eastAsia="Times New Roman" w:hAnsi="Menlo" w:cs="Menlo"/>
+          <w:color w:val="B5CEA8"/>
+          <w:kern w:val="0"/>
+          <w:sz w:val="18"/>
+          <w:szCs w:val="18"/>
+          <w14:ligatures w14:val="none"/>
+        </w:rPr>
+        <w:t>300.f</w:t>
+      </w:r>
+    </w:p>
+    <w:p>
+      <w:pPr>
+        <w:shd w:val="clear" w:color="auto" w:fill="1F1F1F"/>
+        <w:spacing w:after="0" w:line="270" w:lineRule="atLeast"/>
+        <w:rPr>
+          <w:rFonts w:ascii="Menlo" w:eastAsia="Times New Roman" w:hAnsi="Menlo" w:cs="Menlo"/>
+          <w:color w:val="CCCCCC"/>
+          <w:kern w:val="0"/>
+          <w:sz w:val="18"/>
+          <w:szCs w:val="18"/>
+          <w14:ligatures w14:val="none"/>
+        </w:rPr>
+      </w:pPr>
+      <w:r>
+        <w:rPr>
+          <w:rFonts w:ascii="Menlo" w:eastAsia="Times New Roman" w:hAnsi="Menlo" w:cs="Menlo"/>
+          <w:color w:val="CCCCCC"/>
+          <w:kern w:val="0"/>
+          <w:sz w:val="18"/>
+          <w:szCs w:val="18"/>
+          <w14:ligatures w14:val="none"/>
+        </w:rPr>
+        <w:t xml:space="preserve">        );</w:t>
+      </w:r>
+    </w:p>
+    <w:p/>
+    <w:p>
+      <w:r>
+        <w:t xml:space="preserve">Camera is slightly centered on the left </w:t>
+      </w:r>
+      <w:proofErr w:type="gramStart"/>
+      <w:r>
+        <w:t>side</w:t>
+      </w:r>
+      <w:proofErr w:type="gramEnd"/>
+      <w:r>
+        <w:t xml:space="preserve"> so we have space to see incoming obstacles, using the player location getters implemented in </w:t>
+      </w:r>
+      <w:proofErr w:type="spellStart"/>
+      <w:r>
+        <w:t>player.h</w:t>
+      </w:r>
+      <w:proofErr w:type="spellEnd"/>
+      <w:r>
+        <w:t xml:space="preserve"> and player.cpp</w:t>
+      </w:r>
+    </w:p>
+    <w:p>
+      <w:proofErr w:type="spellStart"/>
+      <w:proofErr w:type="gramStart"/>
+      <w:r>
+        <w:t>window.setView</w:t>
+      </w:r>
+      <w:proofErr w:type="spellEnd"/>
+      <w:proofErr w:type="gramEnd"/>
+      <w:r>
+        <w:t>(camera);</w:t>
+      </w:r>
+    </w:p>
+    <w:p>
+      <w:r>
+        <w:t>added camera as the viewpoint in the rendering section</w:t>
+      </w:r>
+    </w:p>
+    <w:p>
+      <w:r>
+        <w:t>The camera’s x-axis is also reset in the reset block when R is pressed</w:t>
       </w:r>
     </w:p>
     <w:p/>

</xml_diff>

<commit_message>
Stage 11: updated player states and adding a finish line
</commit_message>
<xml_diff>
--- a/development log.docx
+++ b/development log.docx
@@ -11277,6 +11277,432 @@
       </w:r>
     </w:p>
     <w:p/>
+    <w:p>
+      <w:r>
+        <w:lastRenderedPageBreak/>
+        <w:t>August 10, 2026</w:t>
+      </w:r>
+    </w:p>
+    <w:p>
+      <w:r>
+        <w:t xml:space="preserve">Stage 10- move some of main into a Game.cpp and </w:t>
+      </w:r>
+      <w:proofErr w:type="spellStart"/>
+      <w:r>
+        <w:t>Game.h</w:t>
+      </w:r>
+      <w:proofErr w:type="spellEnd"/>
+      <w:r>
+        <w:t xml:space="preserve"> class to divide the large Main file.</w:t>
+      </w:r>
+    </w:p>
+    <w:p>
+      <w:r>
+        <w:t>main.cpp</w:t>
+      </w:r>
+      <w:r>
+        <w:t xml:space="preserve"> creates </w:t>
+      </w:r>
+      <w:r>
+        <w:t>Game</w:t>
+      </w:r>
+      <w:r>
+        <w:t>, which:</w:t>
+      </w:r>
+    </w:p>
+    <w:p>
+      <w:r>
+        <w:rPr>
+          <w:rFonts w:hint="eastAsia"/>
+        </w:rPr>
+        <w:t>owns Player</w:t>
+      </w:r>
+      <w:r>
+        <w:t xml:space="preserve">, </w:t>
+      </w:r>
+      <w:r>
+        <w:rPr>
+          <w:rFonts w:hint="eastAsia"/>
+        </w:rPr>
+        <w:t>owns Platforms</w:t>
+      </w:r>
+      <w:r>
+        <w:t xml:space="preserve">, </w:t>
+      </w:r>
+      <w:r>
+        <w:rPr>
+          <w:rFonts w:hint="eastAsia"/>
+        </w:rPr>
+        <w:t>owns Spikes</w:t>
+      </w:r>
+      <w:r>
+        <w:t xml:space="preserve">, </w:t>
+      </w:r>
+      <w:r>
+        <w:rPr>
+          <w:rFonts w:hint="eastAsia"/>
+        </w:rPr>
+        <w:t>owns Window</w:t>
+      </w:r>
+      <w:r>
+        <w:t xml:space="preserve">, and </w:t>
+      </w:r>
+      <w:r>
+        <w:rPr>
+          <w:rFonts w:hint="eastAsia"/>
+        </w:rPr>
+        <w:t>owns Camera</w:t>
+      </w:r>
+    </w:p>
+    <w:p>
+      <w:r>
+        <w:t xml:space="preserve">The original game loop was separated into several functions: </w:t>
+      </w:r>
+      <w:proofErr w:type="spellStart"/>
+      <w:proofErr w:type="gramStart"/>
+      <w:r>
+        <w:t>processEvents</w:t>
+      </w:r>
+      <w:proofErr w:type="spellEnd"/>
+      <w:r>
+        <w:t>(</w:t>
+      </w:r>
+      <w:proofErr w:type="gramEnd"/>
+      <w:r>
+        <w:t xml:space="preserve">) handles keyboard/window events, </w:t>
+      </w:r>
+      <w:proofErr w:type="gramStart"/>
+      <w:r>
+        <w:t>update(</w:t>
+      </w:r>
+      <w:proofErr w:type="gramEnd"/>
+      <w:r>
+        <w:t xml:space="preserve">) updates the game each frame, </w:t>
+      </w:r>
+      <w:proofErr w:type="spellStart"/>
+      <w:proofErr w:type="gramStart"/>
+      <w:r>
+        <w:t>handlePlatformCollisions</w:t>
+      </w:r>
+      <w:proofErr w:type="spellEnd"/>
+      <w:r>
+        <w:t>(</w:t>
+      </w:r>
+      <w:proofErr w:type="gramEnd"/>
+      <w:r>
+        <w:t xml:space="preserve">) and </w:t>
+      </w:r>
+      <w:proofErr w:type="spellStart"/>
+      <w:proofErr w:type="gramStart"/>
+      <w:r>
+        <w:t>handleSpikeCollisions</w:t>
+      </w:r>
+      <w:proofErr w:type="spellEnd"/>
+      <w:r>
+        <w:t>(</w:t>
+      </w:r>
+      <w:proofErr w:type="gramEnd"/>
+      <w:r>
+        <w:t xml:space="preserve">) manage collisions, </w:t>
+      </w:r>
+      <w:proofErr w:type="spellStart"/>
+      <w:proofErr w:type="gramStart"/>
+      <w:r>
+        <w:t>updateCamera</w:t>
+      </w:r>
+      <w:proofErr w:type="spellEnd"/>
+      <w:r>
+        <w:t>(</w:t>
+      </w:r>
+      <w:proofErr w:type="gramEnd"/>
+      <w:r>
+        <w:t xml:space="preserve">) controls the scrolling camera, and </w:t>
+      </w:r>
+      <w:proofErr w:type="gramStart"/>
+      <w:r>
+        <w:t>render(</w:t>
+      </w:r>
+      <w:proofErr w:type="gramEnd"/>
+      <w:r>
+        <w:t>) draws the game.</w:t>
+      </w:r>
+    </w:p>
+    <w:p>
+      <w:r>
+        <w:t xml:space="preserve">The platform and spike initialization was also moved into the Game constructor. main.cpp was simplified so that it only creates a Game object and calls </w:t>
+      </w:r>
+      <w:proofErr w:type="spellStart"/>
+      <w:proofErr w:type="gramStart"/>
+      <w:r>
+        <w:t>game.run</w:t>
+      </w:r>
+      <w:proofErr w:type="spellEnd"/>
+      <w:r>
+        <w:t>(</w:t>
+      </w:r>
+      <w:proofErr w:type="gramEnd"/>
+      <w:r>
+        <w:t xml:space="preserve">). Finally, Game.cpp was added to the </w:t>
+      </w:r>
+      <w:proofErr w:type="spellStart"/>
+      <w:r>
+        <w:t>Makefile</w:t>
+      </w:r>
+      <w:proofErr w:type="spellEnd"/>
+      <w:r>
+        <w:t xml:space="preserve"> so it is compiled with the rest of the project.</w:t>
+      </w:r>
+    </w:p>
+    <w:p/>
+    <w:p>
+      <w:r>
+        <w:t>Stage 11- update the death mechanic + finish line</w:t>
+      </w:r>
+    </w:p>
+    <w:p>
+      <w:pPr>
+        <w:shd w:val="clear" w:color="auto" w:fill="1F1F1F"/>
+        <w:spacing w:after="0" w:line="270" w:lineRule="atLeast"/>
+        <w:rPr>
+          <w:rFonts w:ascii="Menlo" w:eastAsia="Times New Roman" w:hAnsi="Menlo" w:cs="Menlo"/>
+          <w:color w:val="CCCCCC"/>
+          <w:kern w:val="0"/>
+          <w:sz w:val="18"/>
+          <w:szCs w:val="18"/>
+          <w14:ligatures w14:val="none"/>
+        </w:rPr>
+      </w:pPr>
+      <w:proofErr w:type="spellStart"/>
+      <w:r>
+        <w:rPr>
+          <w:rFonts w:ascii="Menlo" w:eastAsia="Times New Roman" w:hAnsi="Menlo" w:cs="Menlo"/>
+          <w:color w:val="569CD6"/>
+          <w:kern w:val="0"/>
+          <w:sz w:val="18"/>
+          <w:szCs w:val="18"/>
+          <w14:ligatures w14:val="none"/>
+        </w:rPr>
+        <w:t>enum</w:t>
+      </w:r>
+      <w:proofErr w:type="spellEnd"/>
+      <w:r>
+        <w:rPr>
+          <w:rFonts w:ascii="Menlo" w:eastAsia="Times New Roman" w:hAnsi="Menlo" w:cs="Menlo"/>
+          <w:color w:val="CCCCCC"/>
+          <w:kern w:val="0"/>
+          <w:sz w:val="18"/>
+          <w:szCs w:val="18"/>
+          <w14:ligatures w14:val="none"/>
+        </w:rPr>
+        <w:t xml:space="preserve"> </w:t>
+      </w:r>
+      <w:r>
+        <w:rPr>
+          <w:rFonts w:ascii="Menlo" w:eastAsia="Times New Roman" w:hAnsi="Menlo" w:cs="Menlo"/>
+          <w:color w:val="569CD6"/>
+          <w:kern w:val="0"/>
+          <w:sz w:val="18"/>
+          <w:szCs w:val="18"/>
+          <w14:ligatures w14:val="none"/>
+        </w:rPr>
+        <w:t>class</w:t>
+      </w:r>
+      <w:r>
+        <w:rPr>
+          <w:rFonts w:ascii="Menlo" w:eastAsia="Times New Roman" w:hAnsi="Menlo" w:cs="Menlo"/>
+          <w:color w:val="CCCCCC"/>
+          <w:kern w:val="0"/>
+          <w:sz w:val="18"/>
+          <w:szCs w:val="18"/>
+          <w14:ligatures w14:val="none"/>
+        </w:rPr>
+        <w:t xml:space="preserve"> </w:t>
+      </w:r>
+      <w:proofErr w:type="spellStart"/>
+      <w:r>
+        <w:rPr>
+          <w:rFonts w:ascii="Menlo" w:eastAsia="Times New Roman" w:hAnsi="Menlo" w:cs="Menlo"/>
+          <w:color w:val="4EC9B0"/>
+          <w:kern w:val="0"/>
+          <w:sz w:val="18"/>
+          <w:szCs w:val="18"/>
+          <w14:ligatures w14:val="none"/>
+        </w:rPr>
+        <w:t>GameState</w:t>
+      </w:r>
+      <w:proofErr w:type="spellEnd"/>
+      <w:r>
+        <w:rPr>
+          <w:rFonts w:ascii="Menlo" w:eastAsia="Times New Roman" w:hAnsi="Menlo" w:cs="Menlo"/>
+          <w:color w:val="CCCCCC"/>
+          <w:kern w:val="0"/>
+          <w:sz w:val="18"/>
+          <w:szCs w:val="18"/>
+          <w14:ligatures w14:val="none"/>
+        </w:rPr>
+        <w:t xml:space="preserve"> {</w:t>
+      </w:r>
+    </w:p>
+    <w:p>
+      <w:pPr>
+        <w:shd w:val="clear" w:color="auto" w:fill="1F1F1F"/>
+        <w:spacing w:after="0" w:line="270" w:lineRule="atLeast"/>
+        <w:rPr>
+          <w:rFonts w:ascii="Menlo" w:eastAsia="Times New Roman" w:hAnsi="Menlo" w:cs="Menlo"/>
+          <w:color w:val="CCCCCC"/>
+          <w:kern w:val="0"/>
+          <w:sz w:val="18"/>
+          <w:szCs w:val="18"/>
+          <w14:ligatures w14:val="none"/>
+        </w:rPr>
+      </w:pPr>
+      <w:r>
+        <w:rPr>
+          <w:rFonts w:ascii="Menlo" w:eastAsia="Times New Roman" w:hAnsi="Menlo" w:cs="Menlo"/>
+          <w:color w:val="CCCCCC"/>
+          <w:kern w:val="0"/>
+          <w:sz w:val="18"/>
+          <w:szCs w:val="18"/>
+          <w14:ligatures w14:val="none"/>
+        </w:rPr>
+        <w:t xml:space="preserve">    </w:t>
+      </w:r>
+      <w:r>
+        <w:rPr>
+          <w:rFonts w:ascii="Menlo" w:eastAsia="Times New Roman" w:hAnsi="Menlo" w:cs="Menlo"/>
+          <w:color w:val="4FC1FF"/>
+          <w:kern w:val="0"/>
+          <w:sz w:val="18"/>
+          <w:szCs w:val="18"/>
+          <w14:ligatures w14:val="none"/>
+        </w:rPr>
+        <w:t>Playing</w:t>
+      </w:r>
+      <w:r>
+        <w:rPr>
+          <w:rFonts w:ascii="Menlo" w:eastAsia="Times New Roman" w:hAnsi="Menlo" w:cs="Menlo"/>
+          <w:color w:val="CCCCCC"/>
+          <w:kern w:val="0"/>
+          <w:sz w:val="18"/>
+          <w:szCs w:val="18"/>
+          <w14:ligatures w14:val="none"/>
+        </w:rPr>
+        <w:t>,</w:t>
+      </w:r>
+    </w:p>
+    <w:p>
+      <w:pPr>
+        <w:shd w:val="clear" w:color="auto" w:fill="1F1F1F"/>
+        <w:spacing w:after="0" w:line="270" w:lineRule="atLeast"/>
+        <w:rPr>
+          <w:rFonts w:ascii="Menlo" w:eastAsia="Times New Roman" w:hAnsi="Menlo" w:cs="Menlo"/>
+          <w:color w:val="CCCCCC"/>
+          <w:kern w:val="0"/>
+          <w:sz w:val="18"/>
+          <w:szCs w:val="18"/>
+          <w14:ligatures w14:val="none"/>
+        </w:rPr>
+      </w:pPr>
+      <w:r>
+        <w:rPr>
+          <w:rFonts w:ascii="Menlo" w:eastAsia="Times New Roman" w:hAnsi="Menlo" w:cs="Menlo"/>
+          <w:color w:val="CCCCCC"/>
+          <w:kern w:val="0"/>
+          <w:sz w:val="18"/>
+          <w:szCs w:val="18"/>
+          <w14:ligatures w14:val="none"/>
+        </w:rPr>
+        <w:t xml:space="preserve">    </w:t>
+      </w:r>
+      <w:r>
+        <w:rPr>
+          <w:rFonts w:ascii="Menlo" w:eastAsia="Times New Roman" w:hAnsi="Menlo" w:cs="Menlo"/>
+          <w:color w:val="4FC1FF"/>
+          <w:kern w:val="0"/>
+          <w:sz w:val="18"/>
+          <w:szCs w:val="18"/>
+          <w14:ligatures w14:val="none"/>
+        </w:rPr>
+        <w:t>Dead</w:t>
+      </w:r>
+      <w:r>
+        <w:rPr>
+          <w:rFonts w:ascii="Menlo" w:eastAsia="Times New Roman" w:hAnsi="Menlo" w:cs="Menlo"/>
+          <w:color w:val="CCCCCC"/>
+          <w:kern w:val="0"/>
+          <w:sz w:val="18"/>
+          <w:szCs w:val="18"/>
+          <w14:ligatures w14:val="none"/>
+        </w:rPr>
+        <w:t>,</w:t>
+      </w:r>
+    </w:p>
+    <w:p>
+      <w:pPr>
+        <w:shd w:val="clear" w:color="auto" w:fill="1F1F1F"/>
+        <w:spacing w:after="0" w:line="270" w:lineRule="atLeast"/>
+        <w:rPr>
+          <w:rFonts w:ascii="Menlo" w:eastAsia="Times New Roman" w:hAnsi="Menlo" w:cs="Menlo"/>
+          <w:color w:val="CCCCCC"/>
+          <w:kern w:val="0"/>
+          <w:sz w:val="18"/>
+          <w:szCs w:val="18"/>
+          <w14:ligatures w14:val="none"/>
+        </w:rPr>
+      </w:pPr>
+      <w:r>
+        <w:rPr>
+          <w:rFonts w:ascii="Menlo" w:eastAsia="Times New Roman" w:hAnsi="Menlo" w:cs="Menlo"/>
+          <w:color w:val="CCCCCC"/>
+          <w:kern w:val="0"/>
+          <w:sz w:val="18"/>
+          <w:szCs w:val="18"/>
+          <w14:ligatures w14:val="none"/>
+        </w:rPr>
+        <w:t xml:space="preserve">    </w:t>
+      </w:r>
+      <w:r>
+        <w:rPr>
+          <w:rFonts w:ascii="Menlo" w:eastAsia="Times New Roman" w:hAnsi="Menlo" w:cs="Menlo"/>
+          <w:color w:val="4FC1FF"/>
+          <w:kern w:val="0"/>
+          <w:sz w:val="18"/>
+          <w:szCs w:val="18"/>
+          <w14:ligatures w14:val="none"/>
+        </w:rPr>
+        <w:t>Complete</w:t>
+      </w:r>
+    </w:p>
+    <w:p>
+      <w:pPr>
+        <w:shd w:val="clear" w:color="auto" w:fill="1F1F1F"/>
+        <w:spacing w:after="0" w:line="270" w:lineRule="atLeast"/>
+        <w:rPr>
+          <w:rFonts w:ascii="Menlo" w:eastAsia="Times New Roman" w:hAnsi="Menlo" w:cs="Menlo"/>
+          <w:color w:val="CCCCCC"/>
+          <w:kern w:val="0"/>
+          <w:sz w:val="18"/>
+          <w:szCs w:val="18"/>
+          <w14:ligatures w14:val="none"/>
+        </w:rPr>
+      </w:pPr>
+      <w:r>
+        <w:rPr>
+          <w:rFonts w:ascii="Menlo" w:eastAsia="Times New Roman" w:hAnsi="Menlo" w:cs="Menlo"/>
+          <w:color w:val="CCCCCC"/>
+          <w:kern w:val="0"/>
+          <w:sz w:val="18"/>
+          <w:szCs w:val="18"/>
+          <w14:ligatures w14:val="none"/>
+        </w:rPr>
+        <w:t>};</w:t>
+      </w:r>
+    </w:p>
+    <w:p>
+      <w:r>
+        <w:t>3 states- Player, Dead, and Complete once crossing the finish line</w:t>
+      </w:r>
+    </w:p>
     <w:p/>
     <w:sectPr>
       <w:pgSz w:w="12240" w:h="15840"/>
@@ -12582,7 +13008,6 @@
   <w:style w:type="character" w:default="1" w:styleId="DefaultParagraphFont">
     <w:name w:val="Default Paragraph Font"/>
     <w:uiPriority w:val="1"/>
-    <w:semiHidden/>
     <w:unhideWhenUsed/>
   </w:style>
   <w:style w:type="table" w:default="1" w:styleId="TableNormal">
@@ -12909,6 +13334,24 @@
       <w14:ligatures w14:val="none"/>
     </w:rPr>
   </w:style>
+  <w:style w:type="paragraph" w:styleId="Date">
+    <w:name w:val="Date"/>
+    <w:basedOn w:val="Normal"/>
+    <w:next w:val="Normal"/>
+    <w:link w:val="DateChar"/>
+    <w:uiPriority w:val="99"/>
+    <w:semiHidden/>
+    <w:unhideWhenUsed/>
+    <w:rsid w:val="002714AF"/>
+  </w:style>
+  <w:style w:type="character" w:customStyle="1" w:styleId="DateChar">
+    <w:name w:val="Date Char"/>
+    <w:basedOn w:val="DefaultParagraphFont"/>
+    <w:link w:val="Date"/>
+    <w:uiPriority w:val="99"/>
+    <w:semiHidden/>
+    <w:rsid w:val="002714AF"/>
+  </w:style>
 </w:styles>
 </file>
 

</xml_diff>